<commit_message>
Polish cross-format publication output
</commit_message>
<xml_diff>
--- a/docs/Instats - The Institutional AI Readiness Pack.docx
+++ b/docs/Instats - The Institutional AI Readiness Pack.docx
@@ -3,7 +3,7 @@
 <w:document xmlns:o="urn:schemas-microsoft-com:office:office" xmlns:r="http://schemas.openxmlformats.org/officeDocument/2006/relationships" xmlns:v="urn:schemas-microsoft-com:vml" xmlns:w="http://schemas.openxmlformats.org/wordprocessingml/2006/main" xmlns:w10="urn:schemas-microsoft-com:office:word" xmlns:wp="http://schemas.openxmlformats.org/drawingml/2006/wordprocessingDrawing" xmlns:pic="http://schemas.openxmlformats.org/drawingml/2006/picture" xmlns:wps="http://schemas.microsoft.com/office/word/2010/wordprocessingShape" xmlns:wpg="http://schemas.microsoft.com/office/word/2010/wordprocessingGroup" xmlns:mc="http://schemas.openxmlformats.org/markup-compatibility/2006" xmlns:wp14="http://schemas.microsoft.com/office/word/2010/wordprocessingDrawing" xmlns:w14="http://schemas.microsoft.com/office/word/2010/wordml" xmlns:w15="http://schemas.microsoft.com/office/word/2012/wordml" mc:Ignorable="w14 wp14 w15">
   <w:body>
     <w:p>
-      <w:hyperlink r:id="rId87">
+      <w:hyperlink r:id="rId30">
         <w:r>
           <w:drawing>
             <wp:inline>
@@ -20,7 +20,7 @@
                       </pic:cNvPicPr>
                     </pic:nvPicPr>
                     <pic:blipFill>
-                      <a:blip r:embed="rId86"/>
+                      <a:blip r:embed="rId29"/>
                       <a:stretch>
                         <a:fillRect/>
                       </a:stretch>
@@ -227,49 +227,29 @@
         <w:keepLines/>
         <w:rPr/>
       </w:pPr>
-      <w:hyperlink r:id="rId8">
-        <w:r>
-          <w:rPr>
-            <w:rStyle w:val="Hyperlink"/>
-            <w:b/>
-            <w:bCs/>
-          </w:rPr>
-          <w:t>Companion report</w:t>
-        </w:r>
-      </w:hyperlink>
       <w:r>
         <w:rPr>
           <w:b/>
           <w:bCs/>
         </w:rPr>
-        <w:t>.</w:t>
+        <w:t>Companion report.</w:t>
       </w:r>
       <w:r>
         <w:rPr/>
         <w:t xml:space="preserve"> Zyphur, M. J. (2026). </w:t>
       </w:r>
-      <w:hyperlink r:id="rId9">
-        <w:r>
-          <w:rPr>
-            <w:rStyle w:val="Hyperlink"/>
-            <w:i/>
-            <w:iCs/>
-          </w:rPr>
-          <w:t>Responsible AI in Academic Research: A Competency Framework for Research Training</w:t>
-        </w:r>
-      </w:hyperlink>
       <w:r>
         <w:rPr>
           <w:i/>
           <w:iCs/>
         </w:rPr>
-        <w:t>.</w:t>
+        <w:t>Responsible AI in Academic Research: A Competency Framework for Research Training.</w:t>
       </w:r>
       <w:r>
         <w:rPr/>
         <w:t xml:space="preserve"> Instats Policy Series. DOI: </w:t>
       </w:r>
-      <w:hyperlink r:id="rId10">
+      <w:hyperlink r:id="rId8">
         <w:r>
           <w:rPr>
             <w:rStyle w:val="Hyperlink"/>
@@ -281,16 +261,13 @@
         <w:rPr/>
         <w:t xml:space="preserve">. This pack operationalizes that report and refers to it throughout as </w:t>
       </w:r>
-      <w:hyperlink r:id="rId11">
-        <w:r>
-          <w:rPr>
-            <w:rStyle w:val="Hyperlink"/>
-            <w:i/>
-            <w:iCs/>
-          </w:rPr>
-          <w:t>the report</w:t>
-        </w:r>
-      </w:hyperlink>
+      <w:r>
+        <w:rPr>
+          <w:i/>
+          <w:iCs/>
+        </w:rPr>
+        <w:t>the report</w:t>
+      </w:r>
       <w:r>
         <w:rPr/>
         <w:t>.</w:t>
@@ -322,107 +299,63 @@
       </w:r>
       <w:r>
         <w:rPr/>
-        <w:t xml:space="preserve">. You may adapt, rewrite, shorten, extend, translate, and redistribute every instrument in this pack, including commercially, with attribution. You may embed the text directly into institutional policy, handbooks, AI-use agreements, and survey platforms without asking for permission. The Instats name and logo are excluded. The </w:t>
-      </w:r>
-      <w:hyperlink r:id="rId12">
+        <w:t>. You may adapt, rewrite, shorten, extend, translate, and redistribute every instrument in this pack, including commercially, with attribution. You may embed the text directly into institutional policy, handbooks, AI-use agreements, and survey platforms without asking for permission. The Instats name and logo are excluded. The companion report is separately licensed CC BY-NC-ND 4.0.</w:t>
+      </w:r>
+      <w:bookmarkEnd w:id="0"/>
+      <w:bookmarkEnd w:id="1"/>
+    </w:p>
+    <w:p>
+      <w:pPr>
+        <w:pStyle w:val="Heading1"/>
+        <w:shd w:val="clear" w:color="auto" w:fill="F5F5F7"/>
+        <w:rPr/>
+      </w:pPr>
+      <w:bookmarkStart w:id="2" w:name="executive-summary"/>
+      <w:r>
+        <w:rPr/>
+        <w:t>Executive summary</w:t>
+      </w:r>
+    </w:p>
+    <w:p>
+      <w:pPr>
+        <w:pStyle w:val="InstatsExecBand"/>
+        <w:rPr/>
+      </w:pPr>
+      <w:r>
+        <w:rPr/>
+        <w:t>Universities increasingly have AI policies, but many still lack an evidence-based picture of how AI is actually used and governed across their research environments. Without that picture, they cannot reliably identify gaps across policy, people, systems, and process, nor can they determine how to strengthen the institutional capabilities that enable rigorous and responsible AI use in research.</w:t>
+      </w:r>
+    </w:p>
+    <w:p>
+      <w:pPr>
+        <w:pStyle w:val="InstatsExecBand"/>
+        <w:rPr/>
+      </w:pPr>
+      <w:r>
+        <w:rPr/>
+        <w:t xml:space="preserve">That is the gap this pack closes. The companion report, </w:t>
+      </w:r>
+      <w:hyperlink r:id="rId9">
         <w:r>
           <w:rPr>
             <w:rStyle w:val="Hyperlink"/>
           </w:rPr>
-          <w:t>companion report</w:t>
+          <w:t>Responsible AI in Academic Research: A Competency Framework for Research Training</w:t>
         </w:r>
       </w:hyperlink>
       <w:r>
         <w:rPr/>
-        <w:t xml:space="preserve"> is separately licensed CC BY-NC-ND 4.0.</w:t>
-      </w:r>
-      <w:bookmarkEnd w:id="0"/>
-      <w:bookmarkEnd w:id="1"/>
+        <w:t>, surveyed institutional AI policies at thirty-eight top-tier doctoral universities across fifteen countries and jurisdictions. It found that the typical institutional posture is an AI policy whose substantive scope ends at plagiarism. Only six of the thirty-eight published AI policies extend past research integrity into AI literacy and valid research practices. Meanwhile, the major academic publishers converged on a common position within about three months of the public release of ChatGPT-3.5, beginning with Nature and Springer Nature on 24 January 2023 and the ICMJE following in May. National research funders converged unevenly across three years, and research practice moved faster than either. The institutions that actually train researchers have not caught up.</w:t>
+      </w:r>
     </w:p>
     <w:p>
       <w:pPr>
-        <w:pStyle w:val="Heading1"/>
-        <w:shd w:val="clear" w:color="auto" w:fill="F5F5F7"/>
-        <w:rPr/>
-      </w:pPr>
-      <w:bookmarkStart w:id="2" w:name="executive-summary"/>
-      <w:r>
-        <w:rPr/>
-        <w:t>Executive summary</w:t>
-      </w:r>
-    </w:p>
-    <w:p>
-      <w:pPr>
         <w:pStyle w:val="InstatsExecBand"/>
         <w:rPr/>
       </w:pPr>
       <w:r>
         <w:rPr/>
-        <w:t>Universities increasingly have AI policies, but many still lack an evidence-based picture of how AI is actually used and governed across their research environments. Without that picture, they cannot reliably identify gaps across policy, people, systems, and process, nor can they determine how to strengthen the institutional capabilities that enable rigorous and responsible AI use in research.</w:t>
-      </w:r>
-    </w:p>
-    <w:p>
-      <w:pPr>
-        <w:pStyle w:val="InstatsExecBand"/>
-        <w:rPr/>
-      </w:pPr>
-      <w:r>
-        <w:rPr/>
-        <w:t xml:space="preserve">That is the gap this pack closes. The </w:t>
-      </w:r>
-      <w:hyperlink r:id="rId13">
-        <w:r>
-          <w:rPr>
-            <w:rStyle w:val="Hyperlink"/>
-          </w:rPr>
-          <w:t>companion report</w:t>
-        </w:r>
-      </w:hyperlink>
-      <w:r>
-        <w:rPr/>
-        <w:t xml:space="preserve"> surveyed institutional AI policies at thirty-eight top-tier doctoral universities across fifteen countries and jurisdictions. It found that the typical institutional posture is an AI policy whose substantive scope ends at plagiarism. Only six of the thirty-eight published AI policies extend past research integrity into AI literacy and valid research practices. Meanwhile, the major academic publishers converged on a common position within about three months of the public release of ChatGPT-3.5, beginning with Nature and Springer Nature on 24 January 2023 and the ICMJE following in May. National research funders converged unevenly across three years, and research practice moved faster than either. The institutions that actually train researchers have not caught up.</w:t>
-      </w:r>
-    </w:p>
-    <w:p>
-      <w:pPr>
-        <w:pStyle w:val="InstatsExecBand"/>
-        <w:rPr/>
-      </w:pPr>
-      <w:hyperlink r:id="rId14">
-        <w:r>
-          <w:rPr>
-            <w:rStyle w:val="Hyperlink"/>
-          </w:rPr>
-          <w:t>The report</w:t>
-        </w:r>
-      </w:hyperlink>
-      <w:r>
-        <w:rPr/>
-        <w:t xml:space="preserve">’s answer is a five-dimension competency framework: human-in-the-loop discipline, responsible use in practice, tooling that promotes responsible use, AI-literate humans, and an institutional benchmarking grid. </w:t>
-      </w:r>
-      <w:hyperlink r:id="rId15">
-        <w:r>
-          <w:rPr>
-            <w:rStyle w:val="Hyperlink"/>
-          </w:rPr>
-          <w:t>The report</w:t>
-        </w:r>
-      </w:hyperlink>
-      <w:r>
-        <w:rPr/>
-        <w:t xml:space="preserve"> requires policy, people, systems, and process to operate together at the applicable maturity level. This pack operationalizes that requirement as twenty dimension-axis cells, assigns each dimension the level of its lowest axis, and calls the limiting axis the binding axis. </w:t>
-      </w:r>
-      <w:hyperlink r:id="rId16">
-        <w:r>
-          <w:rPr>
-            <w:rStyle w:val="Hyperlink"/>
-          </w:rPr>
-          <w:t>The report</w:t>
-        </w:r>
-      </w:hyperlink>
-      <w:r>
-        <w:rPr/>
-        <w:t xml:space="preserve">’s conclusion on the fifth dimension is the primary reason this pack exists: no university in the sample published its own scoring against the framework, so </w:t>
+        <w:t xml:space="preserve">The report’s answer is a five-dimension competency framework: human-in-the-loop discipline, responsible use in practice, tooling that promotes responsible use, AI-literate humans, and an institutional benchmarking grid. The report requires policy, people, systems, and process to operate together at the applicable maturity level. The framework applies this requirement across twenty cells, one for each combination of the five dimensions and four institutional axes. A dimension takes the level of its lowest-scoring axis, which the pack calls the binding axis. The report’s conclusion on the fifth dimension is the primary reason this pack exists: no university in the sample published its own scoring against the framework, so </w:t>
       </w:r>
       <w:r>
         <w:rPr>
@@ -433,31 +366,7 @@
       </w:r>
       <w:r>
         <w:rPr/>
-        <w:t xml:space="preserve"> on Dimension 5 is “a forward-looking standard that the framework’s adopters can elect to populate” (</w:t>
-      </w:r>
-      <w:hyperlink r:id="rId17">
-        <w:r>
-          <w:rPr>
-            <w:rStyle w:val="Hyperlink"/>
-          </w:rPr>
-          <w:t>the report</w:t>
-        </w:r>
-      </w:hyperlink>
-      <w:r>
-        <w:rPr/>
-        <w:t xml:space="preserve"> §4.2). In this framework, the gap analysis lists improvements in order, like climbing a ladder, and each individual improvement is a rung. In other words, </w:t>
-      </w:r>
-      <w:hyperlink r:id="rId18">
-        <w:r>
-          <w:rPr>
-            <w:rStyle w:val="Hyperlink"/>
-          </w:rPr>
-          <w:t>the report</w:t>
-        </w:r>
-      </w:hyperlink>
-      <w:r>
-        <w:rPr/>
-        <w:t xml:space="preserve"> describes a rung that nobody has reached yet. This pack provides the tools for an institution to reach it.</w:t>
+        <w:t xml:space="preserve"> on Dimension 5 is “a forward-looking standard that the framework’s adopters can elect to populate” (the report §4.2). In this framework, the gap analysis lists improvements in order, like climbing a ladder, and each individual improvement is a rung. In other words, the report describes a rung that nobody has reached yet. This pack provides the tools for an institution to reach it.</w:t>
       </w:r>
     </w:p>
     <w:p>
@@ -474,7 +383,7 @@
       </w:r>
       <w:r>
         <w:rPr/>
-        <w:t xml:space="preserve"> Thirteen instruments organized into four modules. The assessment suite (A1 to A5) scores the twenty cells against documentary evidence, tests those scores against what graduate students and their advisors and supervisors actually report, converts the results into concrete work packages with named owners, and reports the findings to a governing body on a single page. The briefings (B1 to B5) present the core decisions each leadership group owns in a concise ten-to-fifteen-minute read. The agreement (G1) is the flagship instrument: a thirty-minute conversation where a doctoral student and their advisor or supervisor decide, task by task, where AI may assist with the work and where judgment must remain strictly human, putting that agreement in writing. The policy library (P1, P2) supplies an adoptable institutional AI-in-research policy template alongside a disclosure standard with ready-to-use statement templates.</w:t>
+        <w:t xml:space="preserve"> The pack contains thirteen instruments organized into four modules. The assessment suite (A1 to A5) scores the twenty cells against documentary evidence, tests those scores against what graduate students and their advisors and supervisors actually report, converts the results into concrete work packages with named owners, and reports the findings to a governing body on a single page. The briefings (B1 to B5) present the core decisions each leadership group owns in a concise ten-to-fifteen-minute read. The agreement (G1) is the flagship instrument: a thirty-minute conversation where a doctoral student and their advisor or supervisor decide, task by task, where AI may assist with the work and where judgment must remain strictly human, putting that agreement in writing. The policy library (P1, P2) supplies an adoptable institutional AI-in-research policy template alongside a disclosure standard with ready-to-use statement templates.</w:t>
       </w:r>
     </w:p>
     <w:p>
@@ -486,7 +395,7 @@
         <w:rPr/>
         <w:t xml:space="preserve">The </w:t>
       </w:r>
-      <w:hyperlink r:id="rId19">
+      <w:hyperlink r:id="rId10">
         <w:r>
           <w:rPr>
             <w:rStyle w:val="Hyperlink"/>
@@ -535,19 +444,7 @@
       </w:r>
       <w:r>
         <w:rPr/>
-        <w:t xml:space="preserve">. That verdict describes the completeness of the A1 documentary assessment. It is not a claim that every survey inference has been independently validated. The assessment does not produce a single institutional score, and no adaptation should attempt to do so. </w:t>
-      </w:r>
-      <w:hyperlink r:id="rId20">
-        <w:r>
-          <w:rPr>
-            <w:rStyle w:val="Hyperlink"/>
-          </w:rPr>
-          <w:t>The report</w:t>
-        </w:r>
-      </w:hyperlink>
-      <w:r>
-        <w:rPr/>
-        <w:t xml:space="preserve"> explains that the diagnostic value of the grid lies in the dimensional pattern rather than a single summary number (§4.3). Reducing the assessment to a single number hides the specific capability bottlenecks and invites unhelpful comparisons between institutions with completely different disciplinary profiles and regulatory environments.</w:t>
+        <w:t>. That verdict describes the completeness of the A1 documentary assessment. It is not a claim that every survey inference has been independently validated. The assessment does not produce a single institutional score, and no adaptation should attempt to do so. The report explains that the diagnostic value of the grid lies in the dimensional pattern rather than a single summary number (§4.3). Reducing the assessment to a single number hides the specific capability bottlenecks and invites unhelpful comparisons between institutions with completely different disciplinary profiles and regulatory environments.</w:t>
       </w:r>
     </w:p>
     <w:p>
@@ -640,7 +537,7 @@
       </w:pPr>
       <w:r>
         <w:rPr/>
-        <w:t xml:space="preserve">The framework is deliberately non-prescriptive about which level an institution should occupy. Academic scope, discipline mix, jurisdiction, and available resources legitimately differ. For example, a small humanities-focused doctoral program and a major medical research university operating across multiple jurisdictions can both defensibly sit at </w:t>
+        <w:t xml:space="preserve">The framework is non-prescriptive about which level an institution should occupy. Academic scope, discipline mix, jurisdiction, and available resources legitimately differ. For example, a small humanities-focused doctoral program and a major medical research university operating across multiple jurisdictions can both defensibly sit at </w:t>
       </w:r>
       <w:r>
         <w:rPr>
@@ -1655,19 +1552,7 @@
       </w:pPr>
       <w:r>
         <w:rPr/>
-        <w:t xml:space="preserve">In the </w:t>
-      </w:r>
-      <w:hyperlink r:id="rId21">
-        <w:r>
-          <w:rPr>
-            <w:rStyle w:val="Hyperlink"/>
-          </w:rPr>
-          <w:t>companion report</w:t>
-        </w:r>
-      </w:hyperlink>
-      <w:r>
-        <w:rPr/>
-        <w:t>, §4.2 concludes its discussion of the fifth dimension with a straightforward observation:</w:t>
+        <w:t>In the companion report, §4.2 concludes its discussion of the fifth dimension with a straightforward observation:</w:t>
       </w:r>
     </w:p>
     <w:p>
@@ -1692,19 +1577,7 @@
       </w:r>
       <w:r>
         <w:rPr/>
-        <w:t xml:space="preserve"> on Dimension 5 is, for now, a forward-looking standard that the framework’s adopters can elect to populate.” (</w:t>
-      </w:r>
-      <w:hyperlink r:id="rId22">
-        <w:r>
-          <w:rPr>
-            <w:rStyle w:val="Hyperlink"/>
-          </w:rPr>
-          <w:t>the report</w:t>
-        </w:r>
-      </w:hyperlink>
-      <w:r>
-        <w:rPr/>
-        <w:t xml:space="preserve"> §4.2.)</w:t>
+        <w:t xml:space="preserve"> on Dimension 5 is, for now, a forward-looking standard that the framework’s adopters can elect to populate.” (the report §4.2.)</w:t>
       </w:r>
     </w:p>
     <w:p>
@@ -1714,19 +1587,7 @@
       </w:pPr>
       <w:r>
         <w:rPr/>
-        <w:t xml:space="preserve">I encourage you to read that as an open invitation rather than a qualification. </w:t>
-      </w:r>
-      <w:hyperlink r:id="rId23">
-        <w:r>
-          <w:rPr>
-            <w:rStyle w:val="Hyperlink"/>
-          </w:rPr>
-          <w:t>The report</w:t>
-        </w:r>
-      </w:hyperlink>
-      <w:r>
-        <w:rPr/>
-        <w:t xml:space="preserve"> describes what </w:t>
+        <w:t xml:space="preserve">I encourage you to read that as an open invitation rather than a qualification. The report describes what </w:t>
       </w:r>
       <w:r>
         <w:rPr>
@@ -1823,19 +1684,7 @@
       </w:r>
       <w:r>
         <w:rPr/>
-        <w:t xml:space="preserve"> The phrase appears in nearly every funder mandate, publisher guideline, university policy, and competency framework in the </w:t>
-      </w:r>
-      <w:hyperlink r:id="rId24">
-        <w:r>
-          <w:rPr>
-            <w:rStyle w:val="Hyperlink"/>
-          </w:rPr>
-          <w:t>companion report</w:t>
-        </w:r>
-      </w:hyperlink>
-      <w:r>
-        <w:rPr/>
-        <w:t>’s evidence base, but its operational meaning is almost never defined in practical detail. For example, the Australian Research Council and the National Health and Medical Research Council state the requirement in a single sentence: “AI-generated content must be verified and should not replace expert opinion or judgement.” That principle is entirely sound, but it does not give anyone practical instructions. It does not tell a graduate student how to handle their analysis on a day-to-day basis, nor does it tell a supervisor what specific checks to perform before approving an analysis chapter.</w:t>
+        <w:t xml:space="preserve"> The phrase appears in nearly every funder mandate, publisher guideline, university policy, and competency framework in the companion report’s evidence base, but its operational meaning is almost never defined in practical detail. For example, the Australian Research Council and the National Health and Medical Research Council state the requirement in a single sentence: “AI-generated content must be verified and should not replace expert opinion or judgement.” That principle is entirely sound, but it does not give anyone practical instructions. It does not tell a graduate student how to handle their analysis on a day-to-day basis, nor does it tell a supervisor what specific checks to perform before approving an analysis chapter.</w:t>
       </w:r>
     </w:p>
     <w:p>
@@ -1926,7 +1775,7 @@
       </w:r>
       <w:r>
         <w:rPr/>
-        <w:t xml:space="preserve"> No outside agency receives your completed assessment. No regulator requires you to complete it, and no external body mandates its use. The framework is deliberately non-prescriptive about which maturity level an institution should target, because institutional contexts and missions vary legitimately. What the framework provides is methodological consistency, ensuring that the criteria used to evaluate maturity are transparent and applied consistently.</w:t>
+        <w:t xml:space="preserve"> No outside agency receives your completed assessment. No regulator requires you to complete it, and no external body mandates its use. The framework is non-prescriptive about which maturity level an institution should target, because institutional contexts and missions vary legitimately. What the framework provides is methodological consistency, ensuring that the criteria used to evaluate maturity are transparent and applied consistently.</w:t>
       </w:r>
     </w:p>
     <w:p>
@@ -1939,52 +1788,11 @@
           <w:b/>
           <w:bCs/>
         </w:rPr>
-        <w:t xml:space="preserve">It is not a substitute for the </w:t>
-      </w:r>
-      <w:hyperlink r:id="rId25">
-        <w:r>
-          <w:rPr>
-            <w:rStyle w:val="Hyperlink"/>
-            <w:b/>
-            <w:bCs/>
-          </w:rPr>
-          <w:t>companion report</w:t>
-        </w:r>
-      </w:hyperlink>
-      <w:r>
-        <w:rPr>
-          <w:b/>
-          <w:bCs/>
-        </w:rPr>
-        <w:t>.</w:t>
-      </w:r>
-      <w:r>
-        <w:rPr/>
-        <w:t xml:space="preserve"> This document restates the core framework in Part 2 in sufficient detail to guide working assessment sessions. However, the comprehensive evidence base (including funder policies, institutional audits, publisher standards, literature on research competencies, and detailed tool taxonomies) lives in the </w:t>
-      </w:r>
-      <w:hyperlink r:id="rId26">
-        <w:r>
-          <w:rPr>
-            <w:rStyle w:val="Hyperlink"/>
-          </w:rPr>
-          <w:t>companion report</w:t>
-        </w:r>
-      </w:hyperlink>
-      <w:r>
-        <w:rPr/>
-        <w:t xml:space="preserve">. I recommend reading </w:t>
-      </w:r>
-      <w:hyperlink r:id="rId27">
-        <w:r>
-          <w:rPr>
-            <w:rStyle w:val="Hyperlink"/>
-          </w:rPr>
-          <w:t>the report</w:t>
-        </w:r>
-      </w:hyperlink>
-      <w:r>
-        <w:rPr/>
-        <w:t xml:space="preserve"> once before conducting the assessment, and keeping this pack on hand during working sessions.</w:t>
+        <w:t>It is not a substitute for the companion report.</w:t>
+      </w:r>
+      <w:r>
+        <w:rPr/>
+        <w:t xml:space="preserve"> This document restates the core framework in Part 2 in sufficient detail to guide working assessment sessions. However, the comprehensive evidence base (including funder policies, institutional audits, publisher standards, literature on research competencies, and detailed tool taxonomies) lives in the companion report. I recommend reading the report once before conducting the assessment, and keeping this pack on hand during working sessions.</w:t>
       </w:r>
     </w:p>
     <w:p>
@@ -2079,9 +1887,10 @@
           </mc:Choice>
           <mc:Fallback>
             <w:pict>
-              <v:rect id="shape_0" fillcolor="white" stroked="t" o:allowincell="t" style="width:453.55pt;height:1.45pt;mso-wrap-style:none;v-text-anchor:middle">
+              <v:rect id="shape_0" fillcolor="white" stroked="t" o:allowincell="f" style="position:absolute;margin-left:0pt;margin-top:-1.55pt;width:453.55pt;height:1.45pt;mso-wrap-style:none;v-text-anchor:middle;mso-position-vertical:top">
                 <v:fill o:detectmouseclick="t" type="solid" color2="black"/>
                 <v:stroke color="black" joinstyle="round" endcap="flat"/>
+                <w10:wrap type="square"/>
               </v:rect>
             </w:pict>
           </mc:Fallback>
@@ -2108,31 +1917,7 @@
       </w:pPr>
       <w:r>
         <w:rPr/>
-        <w:t xml:space="preserve">This section restates the core framework so you can conduct working sessions without needing </w:t>
-      </w:r>
-      <w:hyperlink r:id="rId28">
-        <w:r>
-          <w:rPr>
-            <w:rStyle w:val="Hyperlink"/>
-          </w:rPr>
-          <w:t>the report</w:t>
-        </w:r>
-      </w:hyperlink>
-      <w:r>
-        <w:rPr/>
-        <w:t xml:space="preserve"> open. Each subsection cross-references the corresponding section of the </w:t>
-      </w:r>
-      <w:hyperlink r:id="rId29">
-        <w:r>
-          <w:rPr>
-            <w:rStyle w:val="Hyperlink"/>
-          </w:rPr>
-          <w:t>companion report</w:t>
-        </w:r>
-      </w:hyperlink>
-      <w:r>
-        <w:rPr/>
-        <w:t xml:space="preserve"> where the detailed evidence is documented and identifies the operational method introduced by this pack.</w:t>
+        <w:t>This section restates the core framework so you can conduct working sessions without needing the report open. Each subsection cross-references the corresponding section of the companion report where the detailed evidence is documented and identifies the operational method introduced by this pack.</w:t>
       </w:r>
     </w:p>
     <w:p>
@@ -2300,24 +2085,13 @@
                 <w:lang w:val="en-US" w:eastAsia="en-US" w:bidi="ar-SA"/>
               </w:rPr>
             </w:pPr>
-            <w:hyperlink r:id="rId30">
-              <w:r>
-                <w:rPr>
-                  <w:rStyle w:val="Hyperlink"/>
-                  <w:kern w:val="0"/>
-                  <w:szCs w:val="22"/>
-                  <w:lang w:val="en-US" w:eastAsia="en-US" w:bidi="ar-SA"/>
-                </w:rPr>
-                <w:t>the report</w:t>
-              </w:r>
-            </w:hyperlink>
-            <w:r>
-              <w:rPr>
-                <w:kern w:val="0"/>
-                <w:szCs w:val="22"/>
-                <w:lang w:val="en-US" w:eastAsia="en-US" w:bidi="ar-SA"/>
-              </w:rPr>
-              <w:t xml:space="preserve"> §</w:t>
+            <w:r>
+              <w:rPr>
+                <w:kern w:val="0"/>
+                <w:szCs w:val="22"/>
+                <w:lang w:val="en-US" w:eastAsia="en-US" w:bidi="ar-SA"/>
+              </w:rPr>
+              <w:t>the report §</w:t>
             </w:r>
           </w:p>
         </w:tc>
@@ -3042,19 +2816,7 @@
       </w:r>
       <w:r>
         <w:rPr/>
-        <w:t xml:space="preserve"> a task-level demarcation between labor and judgment, and then enforce it through advising, supervision, and thesis examination. Appendix G of the </w:t>
-      </w:r>
-      <w:hyperlink r:id="rId31">
-        <w:r>
-          <w:rPr>
-            <w:rStyle w:val="Hyperlink"/>
-          </w:rPr>
-          <w:t>companion report</w:t>
-        </w:r>
-      </w:hyperlink>
-      <w:r>
-        <w:rPr/>
-        <w:t xml:space="preserve"> provides a starter catalogue of twenty-one research tasks that academic departments can expand for their specific fields.</w:t>
+        <w:t xml:space="preserve"> a task-level demarcation between labor and judgment, and then enforce it through advising, supervision, and thesis examination. Appendix G of the companion report provides a starter catalogue of twenty-one research tasks that academic departments can expand for their specific fields.</w:t>
       </w:r>
     </w:p>
     <w:p>
@@ -3178,19 +2940,7 @@
       </w:r>
       <w:r>
         <w:rPr/>
-        <w:t xml:space="preserve"> This dimension addresses an institution’s commitment to procure and deploy AI tools that support responsible research practices by design. Relying solely on vendor marketing is insufficient. For instance, the </w:t>
-      </w:r>
-      <w:hyperlink r:id="rId32">
-        <w:r>
-          <w:rPr>
-            <w:rStyle w:val="Hyperlink"/>
-          </w:rPr>
-          <w:t>companion report</w:t>
-        </w:r>
-      </w:hyperlink>
-      <w:r>
-        <w:rPr/>
-        <w:t xml:space="preserve"> examines an independent evaluation of three commercial legal research tools that showed hallucination rates between 17 and 33 percent, despite vendor claims that retrieval grounding eliminated false citations. Retrieval augmentation can reduce hallucinations, but it does not eliminate them. Instead, it often shifts the failure mode from a completely fabricated citation to a misattributed real source, which is much harder to catch. Software procurement standards should therefore evaluate six observable technical properties, listed in §2.5 below.</w:t>
+        <w:t xml:space="preserve"> This dimension addresses an institution’s commitment to procure and deploy AI tools that support responsible research practices by design. Relying solely on vendor marketing is insufficient. For instance, the companion report examines an independent evaluation of three commercial legal research tools that showed hallucination rates between 17 and 33 percent, despite vendor claims that retrieval grounding eliminated false citations. Retrieval augmentation can reduce hallucinations, but it does not eliminate them. Instead, it often shifts the failure mode from a completely fabricated citation to a misattributed real source, which is much harder to catch. Software procurement standards should therefore evaluate six observable technical properties, listed in §2.5 below.</w:t>
       </w:r>
     </w:p>
     <w:p>
@@ -4368,19 +4118,7 @@
       </w:r>
       <w:r>
         <w:rPr/>
-        <w:t xml:space="preserve">. Second, </w:t>
-      </w:r>
-      <w:hyperlink r:id="rId33">
-        <w:r>
-          <w:rPr>
-            <w:rStyle w:val="Hyperlink"/>
-          </w:rPr>
-          <w:t>the report</w:t>
-        </w:r>
-      </w:hyperlink>
-      <w:r>
-        <w:rPr/>
-        <w:t xml:space="preserve"> defines the </w:t>
+        <w:t xml:space="preserve">. Second, the report defines the </w:t>
       </w:r>
       <w:r>
         <w:rPr>
@@ -4391,7 +4129,7 @@
       </w:r>
       <w:r>
         <w:rPr/>
-        <w:t xml:space="preserve"> level conjunctively, requiring policy, people, systems, and process to be in place simultaneously. This pack operationalizes that requirement by assigning each dimension the maturity level of its lowest axis.</w:t>
+        <w:t xml:space="preserve"> level conjunctively, requiring policy, people, systems, and process to be in place simultaneously. The pack applies that rule by setting each dimension at the maturity level of its lowest-scoring axis.</w:t>
       </w:r>
       <w:bookmarkEnd w:id="24"/>
     </w:p>
@@ -6619,19 +6357,7 @@
       </w:pPr>
       <w:r>
         <w:rPr/>
-        <w:t xml:space="preserve">Appendix A of the </w:t>
-      </w:r>
-      <w:hyperlink r:id="rId34">
-        <w:r>
-          <w:rPr>
-            <w:rStyle w:val="Hyperlink"/>
-          </w:rPr>
-          <w:t>companion report</w:t>
-        </w:r>
-      </w:hyperlink>
-      <w:r>
-        <w:rPr/>
-        <w:t xml:space="preserve"> expands every cell into its complete set of observable criteria. In this pack, Instrument A1 translates those criteria into sixty-eight concrete indicators that an institution evaluates using documentary evidence.</w:t>
+        <w:t>Appendix A of the companion report expands every cell into its complete set of observable criteria. In this pack, Instrument A1 translates those criteria into sixty-eight concrete indicators that an institution evaluates using documentary evidence.</w:t>
       </w:r>
       <w:bookmarkEnd w:id="25"/>
     </w:p>
@@ -7393,9 +7119,10 @@
           </mc:Choice>
           <mc:Fallback>
             <w:pict>
-              <v:rect id="shape_0" fillcolor="white" stroked="t" o:allowincell="t" style="width:453.55pt;height:1.45pt;mso-wrap-style:none;v-text-anchor:middle">
+              <v:rect id="shape_0" fillcolor="white" stroked="t" o:allowincell="f" style="position:absolute;margin-left:0pt;margin-top:-1.55pt;width:453.55pt;height:1.45pt;mso-wrap-style:none;v-text-anchor:middle;mso-position-vertical:top">
                 <v:fill o:detectmouseclick="t" type="solid" color2="black"/>
                 <v:stroke color="black" joinstyle="round" endcap="flat"/>
+                <w10:wrap type="square"/>
               </v:rect>
             </w:pict>
           </mc:Fallback>
@@ -7467,7 +7194,7 @@
       </w:r>
       <w:r>
         <w:rPr/>
-        <w:t xml:space="preserve"> Instrument A2 asks doctoral students about their actual experiences: what guidance they received, what training was provided, what their supervisors discussed with them, what forms they completed, and what occurred during milestone reviews. Students experience the daily reality of these policies. A2 deliberately omits the five policy-axis cells because whether a policy exists is a documentary question answered by A1. Instead, A2 answers whether that policy actually reached the student body.</w:t>
+        <w:t xml:space="preserve"> Instrument A2 asks doctoral students about their actual experiences: what guidance they received, what training was provided, what their supervisors discussed with them, what forms they completed, and what occurred during milestone reviews. Students experience the daily reality of these policies. A2 omits the five policy-axis cells because whether a policy exists is a documentary question answered by A1. Instead, A2 answers whether that policy actually reached the student body.</w:t>
       </w:r>
     </w:p>
     <w:p>
@@ -10629,19 +10356,7 @@
       </w:pPr>
       <w:r>
         <w:rPr/>
-        <w:t xml:space="preserve">This cumulative structure operates like a ratchet, ensuring that an institution cannot jump ahead without establishing the necessary foundations. In Appendix A of the </w:t>
-      </w:r>
-      <w:hyperlink r:id="rId35">
-        <w:r>
-          <w:rPr>
-            <w:rStyle w:val="Hyperlink"/>
-          </w:rPr>
-          <w:t>companion report</w:t>
-        </w:r>
-      </w:hyperlink>
-      <w:r>
-        <w:rPr/>
-        <w:t xml:space="preserve">, every </w:t>
+        <w:t xml:space="preserve">This cumulative structure operates like a ratchet, ensuring that an institution cannot jump ahead without establishing the necessary foundations. In Appendix A of the companion report, every </w:t>
       </w:r>
       <w:r>
         <w:rPr>
@@ -10724,19 +10439,7 @@
       </w:r>
       <w:r>
         <w:rPr/>
-        <w:t xml:space="preserve"> It is not the mean, not the median nor the mode, and not the highest score. This is how the pack operationalizes </w:t>
-      </w:r>
-      <w:hyperlink r:id="rId36">
-        <w:r>
-          <w:rPr>
-            <w:rStyle w:val="Hyperlink"/>
-          </w:rPr>
-          <w:t>the report</w:t>
-        </w:r>
-      </w:hyperlink>
-      <w:r>
-        <w:rPr/>
-        <w:t xml:space="preserve">’s conjunctive requirement that policy, people, systems, and process must all be in place and operating on a regular schedule. Therefore, a dimension with three cells at </w:t>
+        <w:t xml:space="preserve"> It is not the mean, not the median nor the mode, and not the highest score. This rule reflects the report’s requirement that policy, people, systems, and process must all be in place and operating on a regular schedule. Therefore, a dimension with three cells at </w:t>
       </w:r>
       <w:r>
         <w:rPr>
@@ -11613,19 +11316,7 @@
       </w:pPr>
       <w:r>
         <w:rPr/>
-        <w:t xml:space="preserve">The </w:t>
-      </w:r>
-      <w:hyperlink r:id="rId37">
-        <w:r>
-          <w:rPr>
-            <w:rStyle w:val="Hyperlink"/>
-          </w:rPr>
-          <w:t>companion report</w:t>
-        </w:r>
-      </w:hyperlink>
-      <w:r>
-        <w:rPr/>
-        <w:t xml:space="preserve"> identifies a fundamental consistency requirement: an institution cannot defensibly claim an </w:t>
+        <w:t xml:space="preserve">The companion report identifies a fundamental consistency requirement: an institution cannot defensibly claim an </w:t>
       </w:r>
       <w:r>
         <w:rPr>
@@ -11938,31 +11629,7 @@
       </w:pPr>
       <w:r>
         <w:rPr/>
-        <w:t xml:space="preserve">This toolkit deliberately avoids calculating an overall institutional score, percentage, star rating, or letter grade, and I strongly advise against adapting it to do so. In the </w:t>
-      </w:r>
-      <w:hyperlink r:id="rId38">
-        <w:r>
-          <w:rPr>
-            <w:rStyle w:val="Hyperlink"/>
-          </w:rPr>
-          <w:t>companion report</w:t>
-        </w:r>
-      </w:hyperlink>
-      <w:r>
-        <w:rPr/>
-        <w:t xml:space="preserve">, analysis of institutional case studies showed that readiness is almost never uniform across all five dimensions. As noted in §4.3 of </w:t>
-      </w:r>
-      <w:hyperlink r:id="rId39">
-        <w:r>
-          <w:rPr>
-            <w:rStyle w:val="Hyperlink"/>
-          </w:rPr>
-          <w:t>the report</w:t>
-        </w:r>
-      </w:hyperlink>
-      <w:r>
-        <w:rPr/>
-        <w:t xml:space="preserve">, the primary diagnostic value of the framework lies in identifying the specific pattern across dimensions rather than generating a single summary number. For instance, the worked example of a UK university scored near the top of the sample on Dimension 1 (human-in-the-loop discipline) while remaining at </w:t>
+        <w:t xml:space="preserve">This toolkit does not calculate an overall institutional score, percentage, star rating, or letter grade, and I strongly advise against adapting it to do so. In the companion report, analysis of institutional case studies showed that readiness is almost never uniform across all five dimensions. As noted in §4.3 of the report, the primary diagnostic value of the framework lies in identifying the specific pattern across dimensions rather than generating a single summary number. For instance, the worked example of a UK university scored near the top of the sample on Dimension 1 (human-in-the-loop discipline) while remaining at </w:t>
       </w:r>
       <w:r>
         <w:rPr>
@@ -12131,19 +11798,7 @@
       </w:pPr>
       <w:r>
         <w:rPr/>
-        <w:t xml:space="preserve">The </w:t>
-      </w:r>
-      <w:hyperlink r:id="rId40">
-        <w:r>
-          <w:rPr>
-            <w:rStyle w:val="Hyperlink"/>
-          </w:rPr>
-          <w:t>companion report</w:t>
-        </w:r>
-      </w:hyperlink>
-      <w:r>
-        <w:rPr/>
-        <w:t xml:space="preserve"> also classifies university AI policies based on their </w:t>
+        <w:t xml:space="preserve">The companion report also classifies university AI policies based on their </w:t>
       </w:r>
       <w:r>
         <w:rPr>
@@ -12173,10 +11828,10 @@
         <w:tblLook w:noHBand="0" w:lastColumn="0" w:firstColumn="0" w:lastRow="0" w:firstRow="1" w:noVBand="0" w:val="0020"/>
       </w:tblPr>
       <w:tblGrid>
-        <w:gridCol w:w="1394"/>
-        <w:gridCol w:w="3727"/>
-        <w:gridCol w:w="2043"/>
-        <w:gridCol w:w="1908"/>
+        <w:gridCol w:w="1386"/>
+        <w:gridCol w:w="3687"/>
+        <w:gridCol w:w="2105"/>
+        <w:gridCol w:w="1894"/>
       </w:tblGrid>
       <w:tr>
         <w:trPr>
@@ -12185,7 +11840,7 @@
         </w:trPr>
         <w:tc>
           <w:tcPr>
-            <w:tcW w:w="1394" w:type="dxa"/>
+            <w:tcW w:w="1386" w:type="dxa"/>
             <w:tcBorders>
               <w:top w:val="single" w:sz="8" w:space="0" w:color="00547B"/>
               <w:bottom w:val="single" w:sz="8" w:space="0" w:color="00547B"/>
@@ -12217,7 +11872,7 @@
         </w:tc>
         <w:tc>
           <w:tcPr>
-            <w:tcW w:w="3727" w:type="dxa"/>
+            <w:tcW w:w="3687" w:type="dxa"/>
             <w:tcBorders>
               <w:top w:val="single" w:sz="8" w:space="0" w:color="00547B"/>
               <w:bottom w:val="single" w:sz="8" w:space="0" w:color="00547B"/>
@@ -12249,7 +11904,7 @@
         </w:tc>
         <w:tc>
           <w:tcPr>
-            <w:tcW w:w="2043" w:type="dxa"/>
+            <w:tcW w:w="2105" w:type="dxa"/>
             <w:tcBorders>
               <w:top w:val="single" w:sz="8" w:space="0" w:color="00547B"/>
               <w:bottom w:val="single" w:sz="8" w:space="0" w:color="00547B"/>
@@ -12275,32 +11930,13 @@
                 <w:szCs w:val="22"/>
                 <w:lang w:val="en-US" w:eastAsia="en-US" w:bidi="ar-SA"/>
               </w:rPr>
-              <w:t xml:space="preserve">In </w:t>
-            </w:r>
-            <w:hyperlink r:id="rId41">
-              <w:r>
-                <w:rPr>
-                  <w:rStyle w:val="Hyperlink"/>
-                  <w:kern w:val="0"/>
-                  <w:szCs w:val="22"/>
-                  <w:lang w:val="en-US" w:eastAsia="en-US" w:bidi="ar-SA"/>
-                </w:rPr>
-                <w:t>the report</w:t>
-              </w:r>
-            </w:hyperlink>
-            <w:r>
-              <w:rPr>
-                <w:kern w:val="0"/>
-                <w:szCs w:val="22"/>
-                <w:lang w:val="en-US" w:eastAsia="en-US" w:bidi="ar-SA"/>
-              </w:rPr>
-              <w:t>’s sample</w:t>
-            </w:r>
-          </w:p>
-        </w:tc>
-        <w:tc>
-          <w:tcPr>
-            <w:tcW w:w="1908" w:type="dxa"/>
+              <w:t>In the report’s sample</w:t>
+            </w:r>
+          </w:p>
+        </w:tc>
+        <w:tc>
+          <w:tcPr>
+            <w:tcW w:w="1894" w:type="dxa"/>
             <w:tcBorders>
               <w:top w:val="single" w:sz="8" w:space="0" w:color="00547B"/>
               <w:bottom w:val="single" w:sz="8" w:space="0" w:color="00547B"/>
@@ -12335,7 +11971,7 @@
         <w:trPr/>
         <w:tc>
           <w:tcPr>
-            <w:tcW w:w="1394" w:type="dxa"/>
+            <w:tcW w:w="1386" w:type="dxa"/>
             <w:tcBorders>
               <w:top w:val="single" w:sz="4" w:space="0" w:color="C9CED2"/>
               <w:bottom w:val="single" w:sz="4" w:space="0" w:color="C9CED2"/>
@@ -12369,7 +12005,7 @@
         </w:tc>
         <w:tc>
           <w:tcPr>
-            <w:tcW w:w="3727" w:type="dxa"/>
+            <w:tcW w:w="3687" w:type="dxa"/>
             <w:tcBorders>
               <w:top w:val="single" w:sz="4" w:space="0" w:color="C9CED2"/>
               <w:bottom w:val="single" w:sz="4" w:space="0" w:color="C9CED2"/>
@@ -12401,7 +12037,7 @@
         </w:tc>
         <w:tc>
           <w:tcPr>
-            <w:tcW w:w="2043" w:type="dxa"/>
+            <w:tcW w:w="2105" w:type="dxa"/>
             <w:tcBorders>
               <w:top w:val="single" w:sz="4" w:space="0" w:color="C9CED2"/>
               <w:bottom w:val="single" w:sz="4" w:space="0" w:color="C9CED2"/>
@@ -12433,7 +12069,7 @@
         </w:tc>
         <w:tc>
           <w:tcPr>
-            <w:tcW w:w="1908" w:type="dxa"/>
+            <w:tcW w:w="1894" w:type="dxa"/>
             <w:tcBorders>
               <w:top w:val="single" w:sz="4" w:space="0" w:color="C9CED2"/>
               <w:bottom w:val="single" w:sz="4" w:space="0" w:color="C9CED2"/>
@@ -12470,7 +12106,7 @@
         </w:trPr>
         <w:tc>
           <w:tcPr>
-            <w:tcW w:w="1394" w:type="dxa"/>
+            <w:tcW w:w="1386" w:type="dxa"/>
             <w:tcBorders>
               <w:top w:val="single" w:sz="4" w:space="0" w:color="C9CED2"/>
               <w:bottom w:val="single" w:sz="4" w:space="0" w:color="C9CED2"/>
@@ -12504,7 +12140,7 @@
         </w:tc>
         <w:tc>
           <w:tcPr>
-            <w:tcW w:w="3727" w:type="dxa"/>
+            <w:tcW w:w="3687" w:type="dxa"/>
             <w:tcBorders>
               <w:top w:val="single" w:sz="4" w:space="0" w:color="C9CED2"/>
               <w:bottom w:val="single" w:sz="4" w:space="0" w:color="C9CED2"/>
@@ -12536,7 +12172,7 @@
         </w:tc>
         <w:tc>
           <w:tcPr>
-            <w:tcW w:w="2043" w:type="dxa"/>
+            <w:tcW w:w="2105" w:type="dxa"/>
             <w:tcBorders>
               <w:top w:val="single" w:sz="4" w:space="0" w:color="C9CED2"/>
               <w:bottom w:val="single" w:sz="4" w:space="0" w:color="C9CED2"/>
@@ -12568,7 +12204,7 @@
         </w:tc>
         <w:tc>
           <w:tcPr>
-            <w:tcW w:w="1908" w:type="dxa"/>
+            <w:tcW w:w="1894" w:type="dxa"/>
             <w:tcBorders>
               <w:top w:val="single" w:sz="4" w:space="0" w:color="C9CED2"/>
               <w:bottom w:val="single" w:sz="4" w:space="0" w:color="C9CED2"/>
@@ -12605,7 +12241,7 @@
         </w:trPr>
         <w:tc>
           <w:tcPr>
-            <w:tcW w:w="1394" w:type="dxa"/>
+            <w:tcW w:w="1386" w:type="dxa"/>
             <w:tcBorders>
               <w:top w:val="single" w:sz="4" w:space="0" w:color="C9CED2"/>
               <w:bottom w:val="single" w:sz="4" w:space="0" w:color="C9CED2"/>
@@ -12639,7 +12275,7 @@
         </w:tc>
         <w:tc>
           <w:tcPr>
-            <w:tcW w:w="3727" w:type="dxa"/>
+            <w:tcW w:w="3687" w:type="dxa"/>
             <w:tcBorders>
               <w:top w:val="single" w:sz="4" w:space="0" w:color="C9CED2"/>
               <w:bottom w:val="single" w:sz="4" w:space="0" w:color="C9CED2"/>
@@ -12671,7 +12307,7 @@
         </w:tc>
         <w:tc>
           <w:tcPr>
-            <w:tcW w:w="2043" w:type="dxa"/>
+            <w:tcW w:w="2105" w:type="dxa"/>
             <w:tcBorders>
               <w:top w:val="single" w:sz="4" w:space="0" w:color="C9CED2"/>
               <w:bottom w:val="single" w:sz="4" w:space="0" w:color="C9CED2"/>
@@ -12703,7 +12339,7 @@
         </w:tc>
         <w:tc>
           <w:tcPr>
-            <w:tcW w:w="1908" w:type="dxa"/>
+            <w:tcW w:w="1894" w:type="dxa"/>
             <w:tcBorders>
               <w:top w:val="single" w:sz="4" w:space="0" w:color="C9CED2"/>
               <w:bottom w:val="single" w:sz="4" w:space="0" w:color="C9CED2"/>
@@ -12740,7 +12376,7 @@
         </w:trPr>
         <w:tc>
           <w:tcPr>
-            <w:tcW w:w="1394" w:type="dxa"/>
+            <w:tcW w:w="1386" w:type="dxa"/>
             <w:tcBorders>
               <w:top w:val="single" w:sz="4" w:space="0" w:color="C9CED2"/>
               <w:bottom w:val="single" w:sz="8" w:space="0" w:color="00547B"/>
@@ -12774,7 +12410,7 @@
         </w:tc>
         <w:tc>
           <w:tcPr>
-            <w:tcW w:w="3727" w:type="dxa"/>
+            <w:tcW w:w="3687" w:type="dxa"/>
             <w:tcBorders>
               <w:top w:val="single" w:sz="4" w:space="0" w:color="C9CED2"/>
               <w:bottom w:val="single" w:sz="8" w:space="0" w:color="00547B"/>
@@ -12806,7 +12442,7 @@
         </w:tc>
         <w:tc>
           <w:tcPr>
-            <w:tcW w:w="2043" w:type="dxa"/>
+            <w:tcW w:w="2105" w:type="dxa"/>
             <w:tcBorders>
               <w:top w:val="single" w:sz="4" w:space="0" w:color="C9CED2"/>
               <w:bottom w:val="single" w:sz="8" w:space="0" w:color="00547B"/>
@@ -12838,7 +12474,7 @@
         </w:tc>
         <w:tc>
           <w:tcPr>
-            <w:tcW w:w="1908" w:type="dxa"/>
+            <w:tcW w:w="1894" w:type="dxa"/>
             <w:tcBorders>
               <w:top w:val="single" w:sz="4" w:space="0" w:color="C9CED2"/>
               <w:bottom w:val="single" w:sz="8" w:space="0" w:color="00547B"/>
@@ -12888,19 +12524,7 @@
       </w:pPr>
       <w:r>
         <w:rPr/>
-        <w:t xml:space="preserve">Class C represents the most common institutional approach, with Classes C and D together accounting for twenty-three of the thirty-eight universities in the </w:t>
-      </w:r>
-      <w:hyperlink r:id="rId42">
-        <w:r>
-          <w:rPr>
-            <w:rStyle w:val="Hyperlink"/>
-          </w:rPr>
-          <w:t>companion report</w:t>
-        </w:r>
-      </w:hyperlink>
-      <w:r>
-        <w:rPr/>
-        <w:t>’s audit (approximately 60 percent). The remaining 40 percent maintain policies that do not extend beyond basic plagiarism rules.</w:t>
+        <w:t>Class C represents the most common institutional approach, with Classes C and D together accounting for twenty-three of the thirty-eight universities in the companion report’s audit (approximately 60 percent). The remaining 40 percent maintain policies that do not extend beyond basic plagiarism rules.</w:t>
       </w:r>
     </w:p>
     <w:p>
@@ -12998,9 +12622,10 @@
           </mc:Choice>
           <mc:Fallback>
             <w:pict>
-              <v:rect id="shape_0" fillcolor="white" stroked="t" o:allowincell="t" style="width:453.55pt;height:1.45pt;mso-wrap-style:none;v-text-anchor:middle">
+              <v:rect id="shape_0" fillcolor="white" stroked="t" o:allowincell="f" style="position:absolute;margin-left:0pt;margin-top:-1.55pt;width:453.55pt;height:1.45pt;mso-wrap-style:none;v-text-anchor:middle;mso-position-vertical:top">
                 <v:fill o:detectmouseclick="t" type="solid" color2="black"/>
                 <v:stroke color="black" joinstyle="round" endcap="flat"/>
+                <w10:wrap type="square"/>
               </v:rect>
             </w:pict>
           </mc:Fallback>
@@ -13526,31 +13151,7 @@
       </w:pPr>
       <w:r>
         <w:rPr/>
-        <w:t xml:space="preserve">Five concise briefings tailored for specific leadership roles, each addressing three core questions: why this issue matters to your role, which specific decisions you uniquely own, and what questions you should ask your team this month. Each briefing is designed to be read independently without requiring prior study of the </w:t>
-      </w:r>
-      <w:hyperlink r:id="rId43">
-        <w:r>
-          <w:rPr>
-            <w:rStyle w:val="Hyperlink"/>
-          </w:rPr>
-          <w:t>companion report</w:t>
-        </w:r>
-      </w:hyperlink>
-      <w:r>
-        <w:rPr/>
-        <w:t xml:space="preserve">. They explicitly reference the relevant grid cells and cross-reference corresponding sections in </w:t>
-      </w:r>
-      <w:hyperlink r:id="rId44">
-        <w:r>
-          <w:rPr>
-            <w:rStyle w:val="Hyperlink"/>
-          </w:rPr>
-          <w:t>the report</w:t>
-        </w:r>
-      </w:hyperlink>
-      <w:r>
-        <w:rPr/>
-        <w:t>.</w:t>
+        <w:t>Five concise briefings tailored for specific leadership roles, each addressing three core questions: why this issue matters to your role, which specific decisions you uniquely own, and what questions you should ask your team this month. Each briefing is designed to be read independently without requiring prior study of the companion report. They explicitly reference the relevant grid cells and cross-reference corresponding sections in the report.</w:t>
       </w:r>
     </w:p>
     <w:p>
@@ -14637,19 +14238,7 @@
       </w:pPr>
       <w:r>
         <w:rPr/>
-        <w:t xml:space="preserve">Instrument G1 was authored independently based on the task taxonomy in Appendix G of the </w:t>
-      </w:r>
-      <w:hyperlink r:id="rId45">
-        <w:r>
-          <w:rPr>
-            <w:rStyle w:val="Hyperlink"/>
-          </w:rPr>
-          <w:t>companion report</w:t>
-        </w:r>
-      </w:hyperlink>
-      <w:r>
-        <w:rPr/>
-        <w:t xml:space="preserve">. Prior published work, notably the University of New Hampshire’s </w:t>
+        <w:t xml:space="preserve">Instrument G1 was authored independently based on the task taxonomy in Appendix G of the companion report. Prior published work, notably the University of New Hampshire’s </w:t>
       </w:r>
       <w:r>
         <w:rPr>
@@ -14711,19 +14300,7 @@
       </w:r>
       <w:r>
         <w:rPr/>
-        <w:t xml:space="preserve">, synthesizing the actual practices of the six Class D universities identified in the </w:t>
-      </w:r>
-      <w:hyperlink r:id="rId46">
-        <w:r>
-          <w:rPr>
-            <w:rStyle w:val="Hyperlink"/>
-          </w:rPr>
-          <w:t>companion report</w:t>
-        </w:r>
-      </w:hyperlink>
-      <w:r>
-        <w:rPr/>
-        <w:t>’s audit. If an institution prefers to target a Class C scope, it can adopt the template while omitting the specific competency and examiner clauses. This is an entirely legitimate strategic choice, but it should be made deliberately rather than through drafting oversights.</w:t>
+        <w:t>, synthesizing the actual practices of the six Class D universities identified in the companion report’s audit. If an institution prefers to target a Class C scope, it can adopt the template while omitting the specific competency and examiner clauses. This is an entirely legitimate strategic choice, but it should be made explicitly rather than through drafting oversights.</w:t>
       </w:r>
     </w:p>
     <w:p>
@@ -14755,19 +14332,7 @@
       </w:r>
       <w:r>
         <w:rPr/>
-        <w:t xml:space="preserve"> identifying the corresponding grid cells, </w:t>
-      </w:r>
-      <w:hyperlink r:id="rId47">
-        <w:r>
-          <w:rPr>
-            <w:rStyle w:val="Hyperlink"/>
-          </w:rPr>
-          <w:t>companion report</w:t>
-        </w:r>
-      </w:hyperlink>
-      <w:r>
-        <w:rPr/>
-        <w:t xml:space="preserve"> sections, and specific audit artifacts required to demonstrate that the clause is actively functioning. Jurisdictional notes highlight where specific phrasing should be tailored to local legislation. These annotations are intended for the drafting committee and are removed prior to publication.</w:t>
+        <w:t xml:space="preserve"> identifying the corresponding grid cells, companion report sections, and specific audit artifacts required to demonstrate that the clause is actively functioning. Jurisdictional notes highlight where specific phrasing should be tailored to local legislation. These annotations are intended for the drafting committee and are removed prior to publication.</w:t>
       </w:r>
     </w:p>
     <w:p>
@@ -15175,9 +14740,10 @@
           </mc:Choice>
           <mc:Fallback>
             <w:pict>
-              <v:rect id="shape_0" fillcolor="white" stroked="t" o:allowincell="t" style="width:453.55pt;height:1.45pt;mso-wrap-style:none;v-text-anchor:middle">
+              <v:rect id="shape_0" fillcolor="white" stroked="t" o:allowincell="f" style="position:absolute;margin-left:0pt;margin-top:-1.55pt;width:453.55pt;height:1.45pt;mso-wrap-style:none;v-text-anchor:middle;mso-position-vertical:top">
                 <v:fill o:detectmouseclick="t" type="solid" color2="black"/>
                 <v:stroke color="black" joinstyle="round" endcap="flat"/>
+                <w10:wrap type="square"/>
               </v:rect>
             </w:pict>
           </mc:Fallback>
@@ -24743,19 +24309,7 @@
       </w:pPr>
       <w:r>
         <w:rPr/>
-        <w:t xml:space="preserve">Northgate sits within the most common national policy category (Class C, representing 45 percent of the </w:t>
-      </w:r>
-      <w:hyperlink r:id="rId48">
-        <w:r>
-          <w:rPr>
-            <w:rStyle w:val="Hyperlink"/>
-          </w:rPr>
-          <w:t>companion report</w:t>
-        </w:r>
-      </w:hyperlink>
-      <w:r>
-        <w:rPr/>
-        <w:t xml:space="preserve">’s audit sample) while three of its five operational dimensions remain </w:t>
+        <w:t xml:space="preserve">Northgate sits within the most common national policy category (Class C, representing 45 percent of the companion report’s audit sample) while three of its five operational dimensions remain </w:t>
       </w:r>
       <w:r>
         <w:rPr>
@@ -26242,9 +25796,10 @@
           </mc:Choice>
           <mc:Fallback>
             <w:pict>
-              <v:rect id="shape_0" fillcolor="white" stroked="t" o:allowincell="t" style="width:453.55pt;height:1.45pt;mso-wrap-style:none;v-text-anchor:middle">
+              <v:rect id="shape_0" fillcolor="white" stroked="t" o:allowincell="f" style="position:absolute;margin-left:0pt;margin-top:-1.55pt;width:453.55pt;height:1.45pt;mso-wrap-style:none;v-text-anchor:middle;mso-position-vertical:top">
                 <v:fill o:detectmouseclick="t" type="solid" color2="black"/>
                 <v:stroke color="black" joinstyle="round" endcap="flat"/>
+                <w10:wrap type="square"/>
               </v:rect>
             </w:pict>
           </mc:Fallback>
@@ -26301,7 +25856,7 @@
         <w:rPr/>
         <w:t xml:space="preserve">The toolkit is licensed under Creative Commons Attribution 4.0 International (CC BY 4.0). You are free to copy, share, modify, translate, incorporate into internal policies, use within commercial training or consulting, and redistribute every instrument in this pack, provided you include appropriate attribution. You do not need to seek permission or notify Instats, though I welcome feedback and case studies at </w:t>
       </w:r>
-      <w:hyperlink r:id="rId49">
+      <w:hyperlink r:id="rId11">
         <w:r>
           <w:rPr>
             <w:rStyle w:val="Hyperlink"/>
@@ -26438,7 +25993,7 @@
         </w:rPr>
         <w:t xml:space="preserve">by Michael J. Zyphur (Instats), licensed under CC BY 4.0, available at </w:t>
       </w:r>
-      <w:hyperlink r:id="rId50">
+      <w:hyperlink r:id="rId12">
         <w:r>
           <w:rPr>
             <w:rStyle w:val="Hyperlink"/>
@@ -26489,7 +26044,7 @@
         </w:rPr>
         <w:t xml:space="preserve">by Michael J. Zyphur (Instats), CC BY 4.0, </w:t>
       </w:r>
-      <w:hyperlink r:id="rId51">
+      <w:hyperlink r:id="rId13">
         <w:r>
           <w:rPr>
             <w:rStyle w:val="Hyperlink"/>
@@ -26607,19 +26162,7 @@
       </w:r>
       <w:r>
         <w:rPr/>
-        <w:t xml:space="preserve"> The core vocabulary (including the five dimension titles, four operational axes, four maturity levels, four AI-use modes, six tool properties, and six core competencies) appears across the thirteen instruments and Start Here. Use consistent terms throughout your translation, and include a brief glossary mapping your terms to the original English definitions so readers can easily reference the </w:t>
-      </w:r>
-      <w:hyperlink r:id="rId52">
-        <w:r>
-          <w:rPr>
-            <w:rStyle w:val="Hyperlink"/>
-          </w:rPr>
-          <w:t>companion report</w:t>
-        </w:r>
-      </w:hyperlink>
-      <w:r>
-        <w:rPr/>
-        <w:t>.</w:t>
+        <w:t xml:space="preserve"> The core vocabulary (including the five dimension titles, four operational axes, four maturity levels, four AI-use modes, six tool properties, and six core competencies) appears across the thirteen instruments and Start Here. Use consistent terms throughout your translation, and include a brief glossary mapping your terms to the original English definitions so readers can easily reference the companion report.</w:t>
       </w:r>
     </w:p>
     <w:p>
@@ -29843,9 +29386,10 @@
           </mc:Choice>
           <mc:Fallback>
             <w:pict>
-              <v:rect id="shape_0" fillcolor="white" stroked="t" o:allowincell="t" style="width:453.55pt;height:1.45pt;mso-wrap-style:none;v-text-anchor:middle">
+              <v:rect id="shape_0" fillcolor="white" stroked="t" o:allowincell="f" style="position:absolute;margin-left:0pt;margin-top:-1.55pt;width:453.55pt;height:1.45pt;mso-wrap-style:none;v-text-anchor:middle;mso-position-vertical:top">
                 <v:fill o:detectmouseclick="t" type="solid" color2="black"/>
                 <v:stroke color="black" joinstyle="round" endcap="flat"/>
+                <w10:wrap type="square"/>
               </v:rect>
             </w:pict>
           </mc:Fallback>
@@ -29957,31 +29501,7 @@
       </w:r>
       <w:r>
         <w:rPr/>
-        <w:t xml:space="preserve"> The Process / People / Practice model in TEQSA’s November 2024 toolkit aligns closely with the four governance axes in the </w:t>
-      </w:r>
-      <w:hyperlink r:id="rId53">
-        <w:r>
-          <w:rPr>
-            <w:rStyle w:val="Hyperlink"/>
-          </w:rPr>
-          <w:t>companion report</w:t>
-        </w:r>
-      </w:hyperlink>
-      <w:r>
-        <w:rPr/>
-        <w:t xml:space="preserve"> (policy, people, systems, and process). This independent structural convergence reinforces the validity of both models. The </w:t>
-      </w:r>
-      <w:hyperlink r:id="rId54">
-        <w:r>
-          <w:rPr>
-            <w:rStyle w:val="Hyperlink"/>
-          </w:rPr>
-          <w:t>companion report</w:t>
-        </w:r>
-      </w:hyperlink>
-      <w:r>
-        <w:rPr/>
-        <w:t xml:space="preserve">’s framework builds on this foundation by adding an explicit </w:t>
+        <w:t xml:space="preserve"> The Process / People / Practice model in TEQSA’s November 2024 toolkit aligns closely with the four governance axes in the companion report (policy, people, systems, and process). This independent structural convergence reinforces the validity of both models. The companion report’s framework builds on this foundation by adding an explicit </w:t>
       </w:r>
       <w:r>
         <w:rPr>
@@ -31212,9 +30732,10 @@
           </mc:Choice>
           <mc:Fallback>
             <w:pict>
-              <v:rect id="shape_0" fillcolor="white" stroked="t" o:allowincell="t" style="width:453.55pt;height:1.45pt;mso-wrap-style:none;v-text-anchor:middle">
+              <v:rect id="shape_0" fillcolor="white" stroked="t" o:allowincell="f" style="position:absolute;margin-left:0pt;margin-top:-1.55pt;width:453.55pt;height:1.45pt;mso-wrap-style:none;v-text-anchor:middle;mso-position-vertical:top">
                 <v:fill o:detectmouseclick="t" type="solid" color2="black"/>
                 <v:stroke color="black" joinstyle="round" endcap="flat"/>
+                <w10:wrap type="square"/>
               </v:rect>
             </w:pict>
           </mc:Fallback>
@@ -31241,19 +30762,7 @@
       </w:pPr>
       <w:r>
         <w:rPr/>
-        <w:t xml:space="preserve">This disclosure documents the use of AI assistance in preparing this pack, following the transparency standards established in Appendix D of the </w:t>
-      </w:r>
-      <w:hyperlink r:id="rId55">
-        <w:r>
-          <w:rPr>
-            <w:rStyle w:val="Hyperlink"/>
-          </w:rPr>
-          <w:t>companion report</w:t>
-        </w:r>
-      </w:hyperlink>
-      <w:r>
-        <w:rPr/>
-        <w:t>.</w:t>
+        <w:t>This disclosure documents the use of AI assistance in preparing this pack, following the transparency standards established in Appendix D of the companion report.</w:t>
       </w:r>
     </w:p>
     <w:p>
@@ -31715,19 +31224,7 @@
       </w:pPr>
       <w:r>
         <w:rPr/>
-        <w:t xml:space="preserve">Draft materials were developed across the thirteen instruments and Start Here, and aligned with the controlled terminology and scoring logic defined in the </w:t>
-      </w:r>
-      <w:hyperlink r:id="rId56">
-        <w:r>
-          <w:rPr>
-            <w:rStyle w:val="Hyperlink"/>
-          </w:rPr>
-          <w:t>companion report</w:t>
-        </w:r>
-      </w:hyperlink>
-      <w:r>
-        <w:rPr/>
-        <w:t>.</w:t>
+        <w:t>Draft materials were developed across the thirteen instruments and Start Here, and aligned with the controlled terminology and scoring logic defined in the companion report.</w:t>
       </w:r>
     </w:p>
     <w:p>
@@ -31744,19 +31241,7 @@
       </w:r>
       <w:r>
         <w:rPr/>
-        <w:t xml:space="preserve"> Tools were used to generate initial drafts from detailed structural outlines, to verify that indicators and cell codes matched across the thirteen instruments and Start Here, to confirm cross-references to the </w:t>
-      </w:r>
-      <w:hyperlink r:id="rId57">
-        <w:r>
-          <w:rPr>
-            <w:rStyle w:val="Hyperlink"/>
-          </w:rPr>
-          <w:t>companion report</w:t>
-        </w:r>
-      </w:hyperlink>
-      <w:r>
-        <w:rPr/>
-        <w:t>, to check the internal calculations in the case study, and to copy-edit. A later pass revised the prose of every document for readability, removing constructions that read as machine-written rather than human-written.</w:t>
+        <w:t xml:space="preserve"> Tools were used to generate initial drafts from detailed structural outlines, to verify that indicators and cell codes matched across the thirteen instruments and Start Here, to confirm cross-references to the companion report, to check the internal calculations in the case study, and to copy-edit. A later pass revised the prose of every document for readability, removing constructions that read as machine-written rather than human-written.</w:t>
       </w:r>
     </w:p>
     <w:p>
@@ -31773,19 +31258,7 @@
       </w:r>
       <w:r>
         <w:rPr/>
-        <w:t xml:space="preserve"> No empirical claims, interpretations of literature, statistical figures, compliance dates, or citations were generated by AI tools without direct verification against the </w:t>
-      </w:r>
-      <w:hyperlink r:id="rId58">
-        <w:r>
-          <w:rPr>
-            <w:rStyle w:val="Hyperlink"/>
-          </w:rPr>
-          <w:t>companion report</w:t>
-        </w:r>
-      </w:hyperlink>
-      <w:r>
-        <w:rPr/>
-        <w:t xml:space="preserve"> and primary evidence dossiers. I authored the core framework architecture, maturity criteria, reconciliation methodology, licensing decisions, and strategic analysis directly.</w:t>
+        <w:t xml:space="preserve"> No empirical claims, interpretations of literature, statistical figures, compliance dates, or citations were generated by AI tools without direct verification against the companion report and primary evidence dossiers. I authored the core framework architecture, maturity criteria, reconciliation methodology, licensing decisions, and strategic analysis directly.</w:t>
       </w:r>
     </w:p>
     <w:p>
@@ -31875,9 +31348,10 @@
           </mc:Choice>
           <mc:Fallback>
             <w:pict>
-              <v:rect id="shape_0" fillcolor="white" stroked="t" o:allowincell="t" style="width:453.55pt;height:1.45pt;mso-wrap-style:none;v-text-anchor:middle">
+              <v:rect id="shape_0" fillcolor="white" stroked="t" o:allowincell="f" style="position:absolute;margin-left:0pt;margin-top:-1.55pt;width:453.55pt;height:1.45pt;mso-wrap-style:none;v-text-anchor:middle;mso-position-vertical:top">
                 <v:fill o:detectmouseclick="t" type="solid" color2="black"/>
                 <v:stroke color="black" joinstyle="round" endcap="flat"/>
+                <w10:wrap type="square"/>
               </v:rect>
             </w:pict>
           </mc:Fallback>
@@ -31940,7 +31414,7 @@
         <w:rPr/>
         <w:t xml:space="preserve"> Instats Policy Series. </w:t>
       </w:r>
-      <w:hyperlink r:id="rId59">
+      <w:hyperlink r:id="rId14">
         <w:r>
           <w:rPr>
             <w:rStyle w:val="Hyperlink"/>
@@ -31952,7 +31426,7 @@
         <w:rPr/>
         <w:t xml:space="preserve">. DOI: </w:t>
       </w:r>
-      <w:hyperlink r:id="rId60">
+      <w:hyperlink r:id="rId15">
         <w:r>
           <w:rPr>
             <w:rStyle w:val="Hyperlink"/>
@@ -32009,7 +31483,7 @@
         <w:rPr/>
         <w:t xml:space="preserve"> Instats Policy Series. </w:t>
       </w:r>
-      <w:hyperlink r:id="rId61">
+      <w:hyperlink r:id="rId16">
         <w:r>
           <w:rPr>
             <w:rStyle w:val="Hyperlink"/>
@@ -32032,18 +31506,8 @@
           <w:b/>
           <w:bCs/>
         </w:rPr>
-        <w:t xml:space="preserve">To cite the </w:t>
-      </w:r>
-      <w:hyperlink r:id="rId62">
-        <w:r>
-          <w:rPr>
-            <w:rStyle w:val="Hyperlink"/>
-            <w:b/>
-            <w:bCs/>
-          </w:rPr>
-          <w:t>companion report</w:t>
-        </w:r>
-      </w:hyperlink>
+        <w:t>To cite the companion report</w:t>
+      </w:r>
       <w:r>
         <w:rPr/>
         <w:t>, containing the full evidence base and theoretical framework:</w:t>
@@ -32058,22 +31522,12 @@
         <w:rPr/>
         <w:t xml:space="preserve">Zyphur, M. J. (2026). </w:t>
       </w:r>
-      <w:hyperlink r:id="rId63">
-        <w:r>
-          <w:rPr>
-            <w:rStyle w:val="Hyperlink"/>
-            <w:i/>
-            <w:iCs/>
-          </w:rPr>
-          <w:t>Responsible AI in Academic Research: A Competency Framework for Research Training</w:t>
-        </w:r>
-      </w:hyperlink>
       <w:r>
         <w:rPr>
           <w:i/>
           <w:iCs/>
         </w:rPr>
-        <w:t>.</w:t>
+        <w:t>Responsible AI in Academic Research: A Competency Framework for Research Training.</w:t>
       </w:r>
       <w:r>
         <w:rPr/>
@@ -32087,19 +31541,7 @@
       </w:pPr>
       <w:r>
         <w:rPr/>
-        <w:t xml:space="preserve">If you are citing the overall theoretical model (the five dimensions, four axes, four maturity levels, and twenty cells), cite the </w:t>
-      </w:r>
-      <w:hyperlink r:id="rId64">
-        <w:r>
-          <w:rPr>
-            <w:rStyle w:val="Hyperlink"/>
-          </w:rPr>
-          <w:t>companion report</w:t>
-        </w:r>
-      </w:hyperlink>
-      <w:r>
-        <w:rPr/>
-        <w:t>. If you are citing a specific diagnostic instrument, indicator, or implementation action item, cite this pack.</w:t>
+        <w:t>If you are citing the overall theoretical model (the five dimensions, four axes, four maturity levels, and twenty cells), cite the companion report. If you are citing a specific diagnostic instrument, indicator, or implementation action item, cite this pack.</w:t>
       </w:r>
       <w:bookmarkEnd w:id="75"/>
     </w:p>
@@ -32121,19 +31563,7 @@
       </w:pPr>
       <w:r>
         <w:rPr/>
-        <w:t xml:space="preserve">The substantive foundations of this pack derive from the </w:t>
-      </w:r>
-      <w:hyperlink r:id="rId65">
-        <w:r>
-          <w:rPr>
-            <w:rStyle w:val="Hyperlink"/>
-          </w:rPr>
-          <w:t>companion report</w:t>
-        </w:r>
-      </w:hyperlink>
-      <w:r>
-        <w:rPr/>
-        <w:t>, which provides the formal definitions, scoring criteria, and empirical evidence summarized here. Key mappings include:</w:t>
+        <w:t>The substantive foundations of this pack derive from the companion report, which provides the formal definitions, scoring criteria, and empirical evidence summarized here. Key mappings include:</w:t>
       </w:r>
     </w:p>
     <w:tbl>
@@ -33493,19 +32923,7 @@
       </w:pPr>
       <w:r>
         <w:rPr/>
-        <w:t xml:space="preserve">Table 22. Mapping of assessment pack components to foundational sections in the </w:t>
-      </w:r>
-      <w:hyperlink r:id="rId66">
-        <w:r>
-          <w:rPr>
-            <w:rStyle w:val="Hyperlink"/>
-          </w:rPr>
-          <w:t>companion report</w:t>
-        </w:r>
-      </w:hyperlink>
-      <w:r>
-        <w:rPr/>
-        <w:t>.</w:t>
+        <w:t>Table 22. Mapping of assessment pack components to foundational sections in the companion report.</w:t>
       </w:r>
     </w:p>
     <w:p>
@@ -33515,31 +32933,7 @@
       </w:pPr>
       <w:r>
         <w:rPr/>
-        <w:t xml:space="preserve">The </w:t>
-      </w:r>
-      <w:hyperlink r:id="rId67">
-        <w:r>
-          <w:rPr>
-            <w:rStyle w:val="Hyperlink"/>
-          </w:rPr>
-          <w:t>companion report</w:t>
-        </w:r>
-      </w:hyperlink>
-      <w:r>
-        <w:rPr/>
-        <w:t xml:space="preserve">’s empirical findings rest on eight primary evidence dossiers covering national research funder policies, university AI regulations, competency models, publisher and journal standards, AI tool taxonomies, international data privacy legislation, research reproducibility literature, and automated adversarial review studies. Every key empirical finding in </w:t>
-      </w:r>
-      <w:hyperlink r:id="rId68">
-        <w:r>
-          <w:rPr>
-            <w:rStyle w:val="Hyperlink"/>
-          </w:rPr>
-          <w:t>the report</w:t>
-        </w:r>
-      </w:hyperlink>
-      <w:r>
-        <w:rPr/>
-        <w:t xml:space="preserve"> is linked to primary sources with archived snapshot dates.</w:t>
+        <w:t>The companion report’s empirical findings rest on eight primary evidence dossiers covering national research funder policies, university AI regulations, competency models, publisher and journal standards, AI tool taxonomies, international data privacy legislation, research reproducibility literature, and automated adversarial review studies. Every key empirical finding in the report is linked to primary sources with archived snapshot dates.</w:t>
       </w:r>
     </w:p>
     <w:p>
@@ -33567,19 +32961,7 @@
       </w:r>
       <w:r>
         <w:rPr/>
-        <w:t xml:space="preserve"> (April 2026) is acknowledged as an early institutional example of a supervisor-student agreement. Instrument G1 was authored independently using the task schedule in Appendix G of the </w:t>
-      </w:r>
-      <w:hyperlink r:id="rId69">
-        <w:r>
-          <w:rPr>
-            <w:rStyle w:val="Hyperlink"/>
-          </w:rPr>
-          <w:t>companion report</w:t>
-        </w:r>
-      </w:hyperlink>
-      <w:r>
-        <w:rPr/>
-        <w:t>. The two documents maintain independent structures and are licensed separately.</w:t>
+        <w:t xml:space="preserve"> (April 2026) is acknowledged as an early institutional example of a supervisor-student agreement. Instrument G1 was authored independently using the task schedule in Appendix G of the companion report. The two documents maintain independent structures and are licensed separately.</w:t>
       </w:r>
     </w:p>
     <w:p>
@@ -33652,9 +33034,10 @@
           </mc:Choice>
           <mc:Fallback>
             <w:pict>
-              <v:rect id="shape_0" fillcolor="white" stroked="t" o:allowincell="t" style="width:453.55pt;height:1.45pt;mso-wrap-style:none;v-text-anchor:middle">
+              <v:rect id="shape_0" fillcolor="white" stroked="t" o:allowincell="f" style="position:absolute;margin-left:0pt;margin-top:-1.55pt;width:453.55pt;height:1.45pt;mso-wrap-style:none;v-text-anchor:middle;mso-position-vertical:top">
                 <v:fill o:detectmouseclick="t" type="solid" color2="black"/>
                 <v:stroke color="black" joinstyle="round" endcap="flat"/>
+                <w10:wrap type="square"/>
               </v:rect>
             </w:pict>
           </mc:Fallback>
@@ -33683,16 +33066,13 @@
         <w:rPr/>
         <w:t xml:space="preserve">Every section in this document maps directly to corresponding sections in the companion report, </w:t>
       </w:r>
-      <w:hyperlink r:id="rId70">
-        <w:r>
-          <w:rPr>
-            <w:rStyle w:val="Hyperlink"/>
-            <w:i/>
-            <w:iCs/>
-          </w:rPr>
-          <w:t>Responsible AI in Academic Research: A Competency Framework for Research Training</w:t>
-        </w:r>
-      </w:hyperlink>
+      <w:r>
+        <w:rPr>
+          <w:i/>
+          <w:iCs/>
+        </w:rPr>
+        <w:t>Responsible AI in Academic Research: A Competency Framework for Research Training</w:t>
+      </w:r>
       <w:r>
         <w:rPr/>
         <w:t>.</w:t>
@@ -33775,24 +33155,13 @@
                 <w:lang w:val="en-US" w:eastAsia="en-US" w:bidi="ar-SA"/>
               </w:rPr>
             </w:pPr>
-            <w:hyperlink r:id="rId71">
-              <w:r>
-                <w:rPr>
-                  <w:rStyle w:val="Hyperlink"/>
-                  <w:kern w:val="0"/>
-                  <w:szCs w:val="22"/>
-                  <w:lang w:val="en-US" w:eastAsia="en-US" w:bidi="ar-SA"/>
-                </w:rPr>
-                <w:t>Companion report</w:t>
-              </w:r>
-            </w:hyperlink>
-            <w:r>
-              <w:rPr>
-                <w:kern w:val="0"/>
-                <w:szCs w:val="22"/>
-                <w:lang w:val="en-US" w:eastAsia="en-US" w:bidi="ar-SA"/>
-              </w:rPr>
-              <w:t xml:space="preserve"> section</w:t>
+            <w:r>
+              <w:rPr>
+                <w:kern w:val="0"/>
+                <w:szCs w:val="22"/>
+                <w:lang w:val="en-US" w:eastAsia="en-US" w:bidi="ar-SA"/>
+              </w:rPr>
+              <w:t>Companion report section</w:t>
             </w:r>
           </w:p>
         </w:tc>
@@ -36754,19 +36123,7 @@
       </w:pPr>
       <w:r>
         <w:rPr/>
-        <w:t xml:space="preserve">Table 23. Comprehensive crosswalk mapping sections of this document to corresponding </w:t>
-      </w:r>
-      <w:hyperlink r:id="rId72">
-        <w:r>
-          <w:rPr>
-            <w:rStyle w:val="Hyperlink"/>
-          </w:rPr>
-          <w:t>companion report</w:t>
-        </w:r>
-      </w:hyperlink>
-      <w:r>
-        <w:rPr/>
-        <w:t xml:space="preserve"> sections.</w:t>
+        <w:t>Table 23. Comprehensive crosswalk mapping sections of this document to corresponding companion report sections.</w:t>
       </w:r>
     </w:p>
     <w:p>
@@ -36822,9 +36179,10 @@
           </mc:Choice>
           <mc:Fallback>
             <w:pict>
-              <v:rect id="shape_0" fillcolor="white" stroked="t" o:allowincell="t" style="width:453.55pt;height:1.45pt;mso-wrap-style:none;v-text-anchor:middle">
+              <v:rect id="shape_0" fillcolor="white" stroked="t" o:allowincell="f" style="position:absolute;margin-left:0pt;margin-top:-1.55pt;width:453.55pt;height:1.45pt;mso-wrap-style:none;v-text-anchor:middle;mso-position-vertical:top">
                 <v:fill o:detectmouseclick="t" type="solid" color2="black"/>
                 <v:stroke color="black" joinstyle="round" endcap="flat"/>
+                <w10:wrap type="square"/>
               </v:rect>
             </w:pict>
           </mc:Fallback>
@@ -36847,7 +36205,7 @@
         </w:rPr>
         <w:t xml:space="preserve">Part of the Instats AI Readiness Pack · </w:t>
       </w:r>
-      <w:hyperlink r:id="rId73">
+      <w:hyperlink r:id="rId17">
         <w:r>
           <w:rPr>
             <w:rStyle w:val="Hyperlink"/>
@@ -36866,19 +36224,7 @@
       </w:r>
       <w:r>
         <w:rPr/>
-        <w:t xml:space="preserve"> </w:t>
-      </w:r>
-      <w:hyperlink r:id="rId74">
-        <w:r>
-          <w:rPr>
-            <w:rStyle w:val="Hyperlink"/>
-          </w:rPr>
-          <w:t>Responsible AI in Academic Research: A Competency Framework for Research Training</w:t>
-        </w:r>
-      </w:hyperlink>
-      <w:r>
-        <w:rPr/>
-        <w:t xml:space="preserve"> </w:t>
+        <w:t xml:space="preserve"> Responsible AI in Academic Research: A Competency Framework for Research Training </w:t>
       </w:r>
       <w:r>
         <w:rPr>
@@ -36890,12 +36236,12 @@
       <w:bookmarkEnd w:id="77"/>
     </w:p>
     <w:sectPr>
-      <w:headerReference w:type="even" r:id="rId75"/>
-      <w:headerReference w:type="default" r:id="rId76"/>
-      <w:headerReference w:type="first" r:id="rId77"/>
-      <w:footerReference w:type="even" r:id="rId78"/>
-      <w:footerReference w:type="default" r:id="rId79"/>
-      <w:footerReference w:type="first" r:id="rId80"/>
+      <w:headerReference w:type="even" r:id="rId18"/>
+      <w:headerReference w:type="default" r:id="rId19"/>
+      <w:headerReference w:type="first" r:id="rId20"/>
+      <w:footerReference w:type="even" r:id="rId21"/>
+      <w:footerReference w:type="default" r:id="rId22"/>
+      <w:footerReference w:type="first" r:id="rId23"/>
       <w:footnotePr>
         <w:numFmt w:val="decimal"/>
       </w:footnotePr>
@@ -36960,7 +36306,7 @@
         <w:i/>
         <w:iCs/>
       </w:rPr>
-      <w:t>62</w:t>
+      <w:t>64</w:t>
     </w:r>
     <w:r>
       <w:rPr>
@@ -37025,19 +36371,7 @@
       </w:r>
       <w:r>
         <w:rPr/>
-        <w:t xml:space="preserve">The </w:t>
-      </w:r>
-      <w:hyperlink r:id="rId1">
-        <w:r>
-          <w:rPr>
-            <w:rStyle w:val="Hyperlink"/>
-          </w:rPr>
-          <w:t>companion report</w:t>
-        </w:r>
-      </w:hyperlink>
-      <w:r>
-        <w:rPr/>
-        <w:t xml:space="preserve"> refers to this dimension using two slightly different titles. The heading in §2.2 reads “Responsible use across the four AI-use modes,” while the Part 4 summary table, Appendix A, and the project repository use “Responsible use in practice.” In this pack, I use </w:t>
+        <w:t xml:space="preserve">The companion report refers to this dimension using two slightly different titles. The heading in §2.2 reads “Responsible use across the four AI-use modes,” while the Part 4 summary table, Appendix A, and the project repository use “Responsible use in practice.” In this pack, I use </w:t>
       </w:r>
       <w:r>
         <w:rPr>
@@ -39390,6 +38724,7 @@
     <w:basedOn w:val="DefaultParagraphFont"/>
     <w:link w:val="Header"/>
     <w:uiPriority w:val="99"/>
+    <w:qFormat/>
     <w:rsid w:val="00e618bf"/>
     <w:rPr>
       <w:rFonts w:ascii="Arial" w:hAnsi="Arial" w:eastAsia="Arial" w:cs="Arial"/>
@@ -39400,6 +38735,7 @@
     <w:basedOn w:val="DefaultParagraphFont"/>
     <w:link w:val="Footer"/>
     <w:uiPriority w:val="99"/>
+    <w:qFormat/>
     <w:rsid w:val="00e618bf"/>
     <w:rPr>
       <w:rFonts w:ascii="Arial" w:hAnsi="Arial" w:eastAsia="Arial" w:cs="Arial"/>
@@ -39410,6 +38746,7 @@
     <w:uiPriority w:val="1"/>
     <w:semiHidden/>
     <w:unhideWhenUsed/>
+    <w:qFormat/>
     <w:rPr>
       <w:rFonts w:ascii="Georgia" w:hAnsi="Georgia" w:eastAsia="Georgia" w:cs="Georgia"/>
     </w:rPr>
@@ -39419,6 +38756,7 @@
     <w:basedOn w:val="DefaultParagraphFont"/>
     <w:link w:val="Heading1"/>
     <w:uiPriority w:val="9"/>
+    <w:qFormat/>
     <w:rsid w:val="00fc693f"/>
     <w:rPr>
       <w:rFonts w:ascii="Arial" w:hAnsi="Arial" w:eastAsia="Arial" w:cs="Arial"/>
@@ -39434,6 +38772,7 @@
     <w:basedOn w:val="DefaultParagraphFont"/>
     <w:link w:val="Heading2"/>
     <w:uiPriority w:val="9"/>
+    <w:qFormat/>
     <w:rsid w:val="00fc693f"/>
     <w:rPr>
       <w:rFonts w:ascii="Arial" w:hAnsi="Arial" w:eastAsia="Arial" w:cs="Arial"/>
@@ -39449,6 +38788,7 @@
     <w:basedOn w:val="DefaultParagraphFont"/>
     <w:link w:val="Heading3"/>
     <w:uiPriority w:val="9"/>
+    <w:qFormat/>
     <w:rsid w:val="00fc693f"/>
     <w:rPr>
       <w:rFonts w:ascii="Arial" w:hAnsi="Arial" w:eastAsia="Arial" w:cs="Arial"/>
@@ -39462,6 +38802,7 @@
     <w:basedOn w:val="DefaultParagraphFont"/>
     <w:link w:val="Title"/>
     <w:uiPriority w:val="10"/>
+    <w:qFormat/>
     <w:rsid w:val="00fc693f"/>
     <w:rPr>
       <w:rFonts w:ascii="Arial" w:hAnsi="Arial" w:eastAsia="Arial" w:cs="Arial"/>
@@ -39477,6 +38818,7 @@
     <w:basedOn w:val="DefaultParagraphFont"/>
     <w:link w:val="Subtitle"/>
     <w:uiPriority w:val="11"/>
+    <w:qFormat/>
     <w:rsid w:val="00fc693f"/>
     <w:rPr>
       <w:rFonts w:ascii="Georgia" w:hAnsi="Georgia" w:eastAsia="Georgia" w:cs="Georgia"/>
@@ -39492,6 +38834,7 @@
     <w:name w:val="Body Text Char"/>
     <w:basedOn w:val="DefaultParagraphFont"/>
     <w:uiPriority w:val="99"/>
+    <w:qFormat/>
     <w:rsid w:val="00aa1d8d"/>
     <w:rPr>
       <w:rFonts w:ascii="Georgia" w:hAnsi="Georgia" w:eastAsia="Georgia" w:cs="Georgia"/>
@@ -39502,6 +38845,7 @@
     <w:basedOn w:val="DefaultParagraphFont"/>
     <w:link w:val="BodyText2"/>
     <w:uiPriority w:val="99"/>
+    <w:qFormat/>
     <w:rsid w:val="00aa1d8d"/>
     <w:rPr>
       <w:rFonts w:ascii="Georgia" w:hAnsi="Georgia" w:eastAsia="Georgia" w:cs="Georgia"/>
@@ -39512,6 +38856,7 @@
     <w:basedOn w:val="DefaultParagraphFont"/>
     <w:link w:val="BodyText3"/>
     <w:uiPriority w:val="99"/>
+    <w:qFormat/>
     <w:rsid w:val="00aa1d8d"/>
     <w:rPr>
       <w:rFonts w:ascii="Georgia" w:hAnsi="Georgia" w:eastAsia="Georgia" w:cs="Georgia"/>
@@ -39524,6 +38869,7 @@
     <w:basedOn w:val="DefaultParagraphFont"/>
     <w:link w:val="MacroText"/>
     <w:uiPriority w:val="99"/>
+    <w:qFormat/>
     <w:rsid w:val="0029639d"/>
     <w:rPr>
       <w:rFonts w:ascii="Georgia" w:hAnsi="Georgia" w:eastAsia="Georgia" w:cs="Georgia"/>
@@ -39536,6 +38882,7 @@
     <w:basedOn w:val="DefaultParagraphFont"/>
     <w:link w:val="Quote"/>
     <w:uiPriority w:val="29"/>
+    <w:qFormat/>
     <w:rsid w:val="00fc693f"/>
     <w:rPr>
       <w:rFonts w:ascii="Georgia" w:hAnsi="Georgia" w:eastAsia="Georgia" w:cs="Georgia"/>
@@ -39550,6 +38897,7 @@
     <w:link w:val="Heading4"/>
     <w:uiPriority w:val="9"/>
     <w:semiHidden/>
+    <w:qFormat/>
     <w:rsid w:val="00fc693f"/>
     <w:rPr>
       <w:rFonts w:ascii="Arial" w:hAnsi="Arial" w:eastAsia="Arial" w:cs="Arial"/>
@@ -39566,6 +38914,7 @@
     <w:link w:val="Heading5"/>
     <w:uiPriority w:val="9"/>
     <w:semiHidden/>
+    <w:qFormat/>
     <w:rsid w:val="00fc693f"/>
     <w:rPr>
       <w:rFonts w:ascii="Arial" w:hAnsi="Arial" w:eastAsia="Arial" w:cs="Arial"/>
@@ -39578,6 +38927,7 @@
     <w:link w:val="Heading6"/>
     <w:uiPriority w:val="9"/>
     <w:semiHidden/>
+    <w:qFormat/>
     <w:rsid w:val="00fc693f"/>
     <w:rPr>
       <w:rFonts w:ascii="Arial" w:hAnsi="Arial" w:eastAsia="Arial" w:cs="Arial"/>
@@ -39592,6 +38942,7 @@
     <w:link w:val="Heading7"/>
     <w:uiPriority w:val="9"/>
     <w:semiHidden/>
+    <w:qFormat/>
     <w:rsid w:val="00fc693f"/>
     <w:rPr>
       <w:rFonts w:ascii="Arial" w:hAnsi="Arial" w:eastAsia="Arial" w:cs="Arial"/>
@@ -39606,6 +38957,7 @@
     <w:link w:val="Heading8"/>
     <w:uiPriority w:val="9"/>
     <w:semiHidden/>
+    <w:qFormat/>
     <w:rsid w:val="00fc693f"/>
     <w:rPr>
       <w:rFonts w:ascii="Arial" w:hAnsi="Arial" w:eastAsia="Arial" w:cs="Arial"/>
@@ -39620,6 +38972,7 @@
     <w:link w:val="Heading9"/>
     <w:uiPriority w:val="9"/>
     <w:semiHidden/>
+    <w:qFormat/>
     <w:rsid w:val="00fc693f"/>
     <w:rPr>
       <w:rFonts w:ascii="Arial" w:hAnsi="Arial" w:eastAsia="Arial" w:cs="Arial"/>
@@ -39659,6 +39012,7 @@
     <w:basedOn w:val="DefaultParagraphFont"/>
     <w:link w:val="IntenseQuote"/>
     <w:uiPriority w:val="30"/>
+    <w:qFormat/>
     <w:rsid w:val="00fc693f"/>
     <w:rPr>
       <w:rFonts w:ascii="Georgia" w:hAnsi="Georgia" w:eastAsia="Georgia" w:cs="Georgia"/>
@@ -39774,6 +39128,7 @@
   </w:style>
   <w:style w:type="character" w:styleId="InstatsVerdictTrue" w:customStyle="1">
     <w:name w:val="InstatsVerdictTrue"/>
+    <w:qFormat/>
     <w:rPr>
       <w:rFonts w:ascii="Arial" w:hAnsi="Arial" w:eastAsia="Arial" w:cs="Arial"/>
       <w:b/>
@@ -39784,6 +39139,7 @@
   </w:style>
   <w:style w:type="character" w:styleId="InstatsVerdictMixed" w:customStyle="1">
     <w:name w:val="InstatsVerdictMixed"/>
+    <w:qFormat/>
     <w:rPr>
       <w:rFonts w:ascii="Arial" w:hAnsi="Arial" w:eastAsia="Arial" w:cs="Arial"/>
       <w:b/>
@@ -39794,6 +39150,7 @@
   </w:style>
   <w:style w:type="character" w:styleId="InstatsVerdictFalse" w:customStyle="1">
     <w:name w:val="InstatsVerdictFalse"/>
+    <w:qFormat/>
     <w:rPr>
       <w:rFonts w:ascii="Arial" w:hAnsi="Arial" w:eastAsia="Arial" w:cs="Arial"/>
       <w:b/>
@@ -39804,6 +39161,7 @@
   </w:style>
   <w:style w:type="character" w:styleId="InstatsVerdictDecomposed" w:customStyle="1">
     <w:name w:val="InstatsVerdictDecomposed"/>
+    <w:qFormat/>
     <w:rPr>
       <w:rFonts w:ascii="Arial" w:hAnsi="Arial" w:eastAsia="Arial" w:cs="Arial"/>
       <w:b/>
@@ -39822,6 +39180,7 @@
   </w:style>
   <w:style w:type="character" w:styleId="VerbatimChar" w:customStyle="1">
     <w:name w:val="VerbatimChar"/>
+    <w:qFormat/>
     <w:rPr>
       <w:rFonts w:ascii="Courier New" w:hAnsi="Courier New" w:eastAsia="Courier New" w:cs="Courier New"/>
       <w:color w:val="212529"/>
@@ -39831,6 +39190,7 @@
   <w:style w:type="character" w:styleId="KeywordTok" w:customStyle="1">
     <w:name w:val="KeywordTok"/>
     <w:basedOn w:val="VerbatimChar"/>
+    <w:qFormat/>
     <w:rPr>
       <w:rFonts w:ascii="Georgia" w:hAnsi="Georgia" w:eastAsia="Georgia" w:cs="Georgia"/>
       <w:b/>
@@ -39840,6 +39200,7 @@
   <w:style w:type="character" w:styleId="DataTypeTok" w:customStyle="1">
     <w:name w:val="DataTypeTok"/>
     <w:basedOn w:val="VerbatimChar"/>
+    <w:qFormat/>
     <w:rPr>
       <w:rFonts w:ascii="Georgia" w:hAnsi="Georgia" w:eastAsia="Georgia" w:cs="Georgia"/>
       <w:color w:val="902000"/>
@@ -39848,6 +39209,7 @@
   <w:style w:type="character" w:styleId="DecValTok" w:customStyle="1">
     <w:name w:val="DecValTok"/>
     <w:basedOn w:val="VerbatimChar"/>
+    <w:qFormat/>
     <w:rPr>
       <w:rFonts w:ascii="Georgia" w:hAnsi="Georgia" w:eastAsia="Georgia" w:cs="Georgia"/>
       <w:color w:val="40A070"/>
@@ -39856,6 +39218,7 @@
   <w:style w:type="character" w:styleId="BaseNTok" w:customStyle="1">
     <w:name w:val="BaseNTok"/>
     <w:basedOn w:val="VerbatimChar"/>
+    <w:qFormat/>
     <w:rPr>
       <w:rFonts w:ascii="Georgia" w:hAnsi="Georgia" w:eastAsia="Georgia" w:cs="Georgia"/>
       <w:color w:val="40A070"/>
@@ -39864,6 +39227,7 @@
   <w:style w:type="character" w:styleId="FloatTok" w:customStyle="1">
     <w:name w:val="FloatTok"/>
     <w:basedOn w:val="VerbatimChar"/>
+    <w:qFormat/>
     <w:rPr>
       <w:rFonts w:ascii="Georgia" w:hAnsi="Georgia" w:eastAsia="Georgia" w:cs="Georgia"/>
       <w:color w:val="40A070"/>
@@ -39872,6 +39236,7 @@
   <w:style w:type="character" w:styleId="ConstantTok" w:customStyle="1">
     <w:name w:val="ConstantTok"/>
     <w:basedOn w:val="VerbatimChar"/>
+    <w:qFormat/>
     <w:rPr>
       <w:rFonts w:ascii="Georgia" w:hAnsi="Georgia" w:eastAsia="Georgia" w:cs="Georgia"/>
       <w:color w:val="880000"/>
@@ -39880,6 +39245,7 @@
   <w:style w:type="character" w:styleId="CharTok" w:customStyle="1">
     <w:name w:val="CharTok"/>
     <w:basedOn w:val="VerbatimChar"/>
+    <w:qFormat/>
     <w:rPr>
       <w:rFonts w:ascii="Georgia" w:hAnsi="Georgia" w:eastAsia="Georgia" w:cs="Georgia"/>
       <w:color w:val="4070A0"/>
@@ -39888,6 +39254,7 @@
   <w:style w:type="character" w:styleId="SpecialCharTok" w:customStyle="1">
     <w:name w:val="SpecialCharTok"/>
     <w:basedOn w:val="VerbatimChar"/>
+    <w:qFormat/>
     <w:rPr>
       <w:rFonts w:ascii="Georgia" w:hAnsi="Georgia" w:eastAsia="Georgia" w:cs="Georgia"/>
       <w:color w:val="4070A0"/>
@@ -39896,6 +39263,7 @@
   <w:style w:type="character" w:styleId="StringTok" w:customStyle="1">
     <w:name w:val="StringTok"/>
     <w:basedOn w:val="VerbatimChar"/>
+    <w:qFormat/>
     <w:rPr>
       <w:rFonts w:ascii="Georgia" w:hAnsi="Georgia" w:eastAsia="Georgia" w:cs="Georgia"/>
       <w:color w:val="4070A0"/>
@@ -39904,6 +39272,7 @@
   <w:style w:type="character" w:styleId="VerbatimStringTok" w:customStyle="1">
     <w:name w:val="VerbatimStringTok"/>
     <w:basedOn w:val="VerbatimChar"/>
+    <w:qFormat/>
     <w:rPr>
       <w:rFonts w:ascii="Courier New" w:hAnsi="Courier New" w:eastAsia="Courier New" w:cs="Courier New"/>
       <w:color w:val="4070A0"/>
@@ -39912,6 +39281,7 @@
   <w:style w:type="character" w:styleId="SpecialStringTok" w:customStyle="1">
     <w:name w:val="SpecialStringTok"/>
     <w:basedOn w:val="VerbatimChar"/>
+    <w:qFormat/>
     <w:rPr>
       <w:rFonts w:ascii="Georgia" w:hAnsi="Georgia" w:eastAsia="Georgia" w:cs="Georgia"/>
       <w:color w:val="BB6688"/>
@@ -39920,6 +39290,7 @@
   <w:style w:type="character" w:styleId="ImportTok" w:customStyle="1">
     <w:name w:val="ImportTok"/>
     <w:basedOn w:val="VerbatimChar"/>
+    <w:qFormat/>
     <w:rPr>
       <w:rFonts w:ascii="Georgia" w:hAnsi="Georgia" w:eastAsia="Georgia" w:cs="Georgia"/>
       <w:b/>
@@ -39929,6 +39300,7 @@
   <w:style w:type="character" w:styleId="CommentTok" w:customStyle="1">
     <w:name w:val="CommentTok"/>
     <w:basedOn w:val="VerbatimChar"/>
+    <w:qFormat/>
     <w:rPr>
       <w:rFonts w:ascii="Georgia" w:hAnsi="Georgia" w:eastAsia="Georgia" w:cs="Georgia"/>
       <w:i/>
@@ -39938,6 +39310,7 @@
   <w:style w:type="character" w:styleId="DocumentationTok" w:customStyle="1">
     <w:name w:val="DocumentationTok"/>
     <w:basedOn w:val="VerbatimChar"/>
+    <w:qFormat/>
     <w:rPr>
       <w:rFonts w:ascii="Georgia" w:hAnsi="Georgia" w:eastAsia="Georgia" w:cs="Georgia"/>
       <w:i/>
@@ -39947,6 +39320,7 @@
   <w:style w:type="character" w:styleId="AnnotationTok" w:customStyle="1">
     <w:name w:val="AnnotationTok"/>
     <w:basedOn w:val="VerbatimChar"/>
+    <w:qFormat/>
     <w:rPr>
       <w:rFonts w:ascii="Georgia" w:hAnsi="Georgia" w:eastAsia="Georgia" w:cs="Georgia"/>
       <w:b/>
@@ -39957,6 +39331,7 @@
   <w:style w:type="character" w:styleId="CommentVarTok" w:customStyle="1">
     <w:name w:val="CommentVarTok"/>
     <w:basedOn w:val="VerbatimChar"/>
+    <w:qFormat/>
     <w:rPr>
       <w:rFonts w:ascii="Georgia" w:hAnsi="Georgia" w:eastAsia="Georgia" w:cs="Georgia"/>
       <w:b/>
@@ -39967,6 +39342,7 @@
   <w:style w:type="character" w:styleId="OtherTok" w:customStyle="1">
     <w:name w:val="OtherTok"/>
     <w:basedOn w:val="VerbatimChar"/>
+    <w:qFormat/>
     <w:rPr>
       <w:rFonts w:ascii="Georgia" w:hAnsi="Georgia" w:eastAsia="Georgia" w:cs="Georgia"/>
       <w:color w:val="007020"/>
@@ -39975,6 +39351,7 @@
   <w:style w:type="character" w:styleId="FunctionTok" w:customStyle="1">
     <w:name w:val="FunctionTok"/>
     <w:basedOn w:val="VerbatimChar"/>
+    <w:qFormat/>
     <w:rPr>
       <w:rFonts w:ascii="Georgia" w:hAnsi="Georgia" w:eastAsia="Georgia" w:cs="Georgia"/>
       <w:color w:val="06287E"/>
@@ -39983,6 +39360,7 @@
   <w:style w:type="character" w:styleId="VariableTok" w:customStyle="1">
     <w:name w:val="VariableTok"/>
     <w:basedOn w:val="VerbatimChar"/>
+    <w:qFormat/>
     <w:rPr>
       <w:rFonts w:ascii="Georgia" w:hAnsi="Georgia" w:eastAsia="Georgia" w:cs="Georgia"/>
       <w:color w:val="19177C"/>
@@ -39991,6 +39369,7 @@
   <w:style w:type="character" w:styleId="ControlFlowTok" w:customStyle="1">
     <w:name w:val="ControlFlowTok"/>
     <w:basedOn w:val="VerbatimChar"/>
+    <w:qFormat/>
     <w:rPr>
       <w:rFonts w:ascii="Georgia" w:hAnsi="Georgia" w:eastAsia="Georgia" w:cs="Georgia"/>
       <w:b/>
@@ -40000,6 +39379,7 @@
   <w:style w:type="character" w:styleId="OperatorTok" w:customStyle="1">
     <w:name w:val="OperatorTok"/>
     <w:basedOn w:val="VerbatimChar"/>
+    <w:qFormat/>
     <w:rPr>
       <w:rFonts w:ascii="Georgia" w:hAnsi="Georgia" w:eastAsia="Georgia" w:cs="Georgia"/>
       <w:color w:val="666666"/>
@@ -40008,6 +39388,7 @@
   <w:style w:type="character" w:styleId="BuiltInTok" w:customStyle="1">
     <w:name w:val="BuiltInTok"/>
     <w:basedOn w:val="VerbatimChar"/>
+    <w:qFormat/>
     <w:rPr>
       <w:rFonts w:ascii="Georgia" w:hAnsi="Georgia" w:eastAsia="Georgia" w:cs="Georgia"/>
       <w:color w:val="008000"/>
@@ -40016,6 +39397,7 @@
   <w:style w:type="character" w:styleId="ExtensionTok" w:customStyle="1">
     <w:name w:val="ExtensionTok"/>
     <w:basedOn w:val="VerbatimChar"/>
+    <w:qFormat/>
     <w:rPr>
       <w:rFonts w:ascii="Georgia" w:hAnsi="Georgia" w:eastAsia="Georgia" w:cs="Georgia"/>
     </w:rPr>
@@ -40023,6 +39405,7 @@
   <w:style w:type="character" w:styleId="PreprocessorTok" w:customStyle="1">
     <w:name w:val="PreprocessorTok"/>
     <w:basedOn w:val="VerbatimChar"/>
+    <w:qFormat/>
     <w:rPr>
       <w:rFonts w:ascii="Georgia" w:hAnsi="Georgia" w:eastAsia="Georgia" w:cs="Georgia"/>
       <w:color w:val="BC7A00"/>
@@ -40031,6 +39414,7 @@
   <w:style w:type="character" w:styleId="AttributeTok" w:customStyle="1">
     <w:name w:val="AttributeTok"/>
     <w:basedOn w:val="VerbatimChar"/>
+    <w:qFormat/>
     <w:rPr>
       <w:rFonts w:ascii="Georgia" w:hAnsi="Georgia" w:eastAsia="Georgia" w:cs="Georgia"/>
       <w:color w:val="7D9029"/>
@@ -40039,6 +39423,7 @@
   <w:style w:type="character" w:styleId="RegionMarkerTok" w:customStyle="1">
     <w:name w:val="RegionMarkerTok"/>
     <w:basedOn w:val="VerbatimChar"/>
+    <w:qFormat/>
     <w:rPr>
       <w:rFonts w:ascii="Georgia" w:hAnsi="Georgia" w:eastAsia="Georgia" w:cs="Georgia"/>
     </w:rPr>
@@ -40046,6 +39431,7 @@
   <w:style w:type="character" w:styleId="InformationTok" w:customStyle="1">
     <w:name w:val="InformationTok"/>
     <w:basedOn w:val="VerbatimChar"/>
+    <w:qFormat/>
     <w:rPr>
       <w:rFonts w:ascii="Georgia" w:hAnsi="Georgia" w:eastAsia="Georgia" w:cs="Georgia"/>
       <w:b/>
@@ -40056,6 +39442,7 @@
   <w:style w:type="character" w:styleId="WarningTok" w:customStyle="1">
     <w:name w:val="WarningTok"/>
     <w:basedOn w:val="VerbatimChar"/>
+    <w:qFormat/>
     <w:rPr>
       <w:rFonts w:ascii="Georgia" w:hAnsi="Georgia" w:eastAsia="Georgia" w:cs="Georgia"/>
       <w:b/>
@@ -40066,6 +39453,7 @@
   <w:style w:type="character" w:styleId="AlertTok" w:customStyle="1">
     <w:name w:val="AlertTok"/>
     <w:basedOn w:val="VerbatimChar"/>
+    <w:qFormat/>
     <w:rPr>
       <w:rFonts w:ascii="Georgia" w:hAnsi="Georgia" w:eastAsia="Georgia" w:cs="Georgia"/>
       <w:b/>
@@ -40075,6 +39463,7 @@
   <w:style w:type="character" w:styleId="ErrorTok" w:customStyle="1">
     <w:name w:val="ErrorTok"/>
     <w:basedOn w:val="VerbatimChar"/>
+    <w:qFormat/>
     <w:rPr>
       <w:rFonts w:ascii="Georgia" w:hAnsi="Georgia" w:eastAsia="Georgia" w:cs="Georgia"/>
       <w:b/>
@@ -40084,6 +39473,7 @@
   <w:style w:type="character" w:styleId="NormalTok" w:customStyle="1">
     <w:name w:val="NormalTok"/>
     <w:basedOn w:val="VerbatimChar"/>
+    <w:qFormat/>
     <w:rPr>
       <w:rFonts w:ascii="Georgia" w:hAnsi="Georgia" w:eastAsia="Georgia" w:cs="Georgia"/>
     </w:rPr>
@@ -40133,10 +39523,12 @@
     <w:unhideWhenUsed/>
     <w:rsid w:val="00aa1d8d"/>
     <w:pPr>
-      <w:spacing w:before="0" w:after="120"/>
+      <w:spacing w:lineRule="auto" w:line="348" w:before="0" w:after="160"/>
     </w:pPr>
     <w:rPr>
       <w:rFonts w:ascii="Georgia" w:hAnsi="Georgia" w:eastAsia="Georgia" w:cs="Georgia"/>
+      <w:color w:val="212529"/>
+      <w:sz w:val="24"/>
     </w:rPr>
   </w:style>
   <w:style w:type="paragraph" w:styleId="List">
@@ -40319,6 +39711,7 @@
     <w:link w:val="BodyText2Char"/>
     <w:uiPriority w:val="99"/>
     <w:unhideWhenUsed/>
+    <w:qFormat/>
     <w:rsid w:val="00aa1d8d"/>
     <w:pPr>
       <w:spacing w:lineRule="auto" w:line="480" w:before="0" w:after="120"/>
@@ -40333,6 +39726,7 @@
     <w:link w:val="BodyText3Char"/>
     <w:uiPriority w:val="99"/>
     <w:unhideWhenUsed/>
+    <w:qFormat/>
     <w:rsid w:val="00aa1d8d"/>
     <w:pPr>
       <w:spacing w:before="0" w:after="120"/>
@@ -40348,6 +39742,7 @@
     <w:basedOn w:val="Normal"/>
     <w:uiPriority w:val="99"/>
     <w:unhideWhenUsed/>
+    <w:qFormat/>
     <w:rsid w:val="00326f90"/>
     <w:pPr>
       <w:spacing w:before="0" w:after="160"/>
@@ -40363,6 +39758,7 @@
     <w:basedOn w:val="Normal"/>
     <w:uiPriority w:val="99"/>
     <w:unhideWhenUsed/>
+    <w:qFormat/>
     <w:rsid w:val="00326f90"/>
     <w:pPr>
       <w:spacing w:before="0" w:after="160"/>
@@ -40531,6 +39927,7 @@
     <w:link w:val="MacroTextChar"/>
     <w:uiPriority w:val="99"/>
     <w:unhideWhenUsed/>
+    <w:qFormat/>
     <w:rsid w:val="0029639d"/>
     <w:pPr>
       <w:widowControl/>
@@ -40632,6 +40029,7 @@
   <w:style w:type="paragraph" w:styleId="InstatsCoverTitle" w:customStyle="1">
     <w:name w:val="InstatsCoverTitle"/>
     <w:basedOn w:val="Normal"/>
+    <w:qFormat/>
     <w:pPr>
       <w:spacing w:lineRule="auto" w:line="264" w:before="0" w:after="120"/>
       <w:jc w:val="start"/>
@@ -40646,6 +40044,7 @@
   <w:style w:type="paragraph" w:styleId="InstatsCoverSubtitle" w:customStyle="1">
     <w:name w:val="InstatsCoverSubtitle"/>
     <w:basedOn w:val="Normal"/>
+    <w:qFormat/>
     <w:pPr>
       <w:spacing w:lineRule="auto" w:line="288" w:before="0" w:after="480"/>
     </w:pPr>
@@ -40659,6 +40058,7 @@
   <w:style w:type="paragraph" w:styleId="InstatsCoverAuthor" w:customStyle="1">
     <w:name w:val="InstatsCoverAuthor"/>
     <w:basedOn w:val="Normal"/>
+    <w:qFormat/>
     <w:pPr>
       <w:spacing w:lineRule="auto" w:line="300" w:before="0" w:after="40"/>
     </w:pPr>
@@ -40671,6 +40071,7 @@
   <w:style w:type="paragraph" w:styleId="InstatsCoverBand" w:customStyle="1">
     <w:name w:val="InstatsCoverBand"/>
     <w:basedOn w:val="Normal"/>
+    <w:qFormat/>
     <w:pPr>
       <w:shd w:val="clear" w:color="auto" w:fill="00547B"/>
       <w:spacing w:lineRule="auto" w:line="276" w:before="160" w:after="240"/>
@@ -40686,6 +40087,7 @@
   </w:style>
   <w:style w:type="paragraph" w:styleId="InstatsKicker" w:customStyle="1">
     <w:name w:val="InstatsKicker"/>
+    <w:qFormat/>
     <w:pPr>
       <w:widowControl/>
       <w:suppressAutoHyphens w:val="true"/>
@@ -40706,6 +40108,7 @@
   </w:style>
   <w:style w:type="paragraph" w:styleId="InstatsFigKicker" w:customStyle="1">
     <w:name w:val="InstatsFigKicker"/>
+    <w:qFormat/>
     <w:pPr>
       <w:widowControl/>
       <w:suppressAutoHyphens w:val="true"/>
@@ -40728,6 +40131,7 @@
   <w:style w:type="paragraph" w:styleId="InstatsAbstract" w:customStyle="1">
     <w:name w:val="InstatsAbstract"/>
     <w:basedOn w:val="Normal"/>
+    <w:qFormat/>
     <w:pPr>
       <w:spacing w:lineRule="auto" w:line="348" w:before="160" w:after="320"/>
       <w:ind w:end="1701"/>
@@ -40741,6 +40145,7 @@
   </w:style>
   <w:style w:type="paragraph" w:styleId="InstatsLede" w:customStyle="1">
     <w:name w:val="InstatsLede"/>
+    <w:qFormat/>
     <w:pPr>
       <w:widowControl/>
       <w:pBdr>
@@ -40764,6 +40169,7 @@
   </w:style>
   <w:style w:type="paragraph" w:styleId="InstatsPullquote" w:customStyle="1">
     <w:name w:val="InstatsPullquote"/>
+    <w:qFormat/>
     <w:pPr>
       <w:widowControl/>
       <w:pBdr>
@@ -40787,6 +40193,7 @@
   </w:style>
   <w:style w:type="paragraph" w:styleId="InstatsPullquoteCite" w:customStyle="1">
     <w:name w:val="InstatsPullquoteCite"/>
+    <w:qFormat/>
     <w:pPr>
       <w:widowControl/>
       <w:suppressAutoHyphens w:val="true"/>
@@ -40807,6 +40214,7 @@
   </w:style>
   <w:style w:type="paragraph" w:styleId="InstatsMetaLine" w:customStyle="1">
     <w:name w:val="InstatsMetaLine"/>
+    <w:qFormat/>
     <w:pPr>
       <w:widowControl/>
       <w:suppressAutoHyphens w:val="true"/>
@@ -40827,6 +40235,7 @@
   <w:style w:type="paragraph" w:styleId="InstatsColophon" w:customStyle="1">
     <w:name w:val="InstatsColophon"/>
     <w:basedOn w:val="Normal"/>
+    <w:qFormat/>
     <w:pPr>
       <w:pBdr>
         <w:left w:val="single" w:sz="24" w:space="10" w:color="3092B1"/>
@@ -40843,6 +40252,7 @@
   <w:style w:type="paragraph" w:styleId="InstatsExecBand" w:customStyle="1">
     <w:name w:val="InstatsExecBand"/>
     <w:basedOn w:val="Normal"/>
+    <w:qFormat/>
     <w:pPr>
       <w:shd w:val="clear" w:color="auto" w:fill="F5F5F7"/>
       <w:spacing w:lineRule="auto" w:line="300" w:before="80" w:after="80"/>
@@ -40855,6 +40265,7 @@
   <w:style w:type="paragraph" w:styleId="InstatsCallout" w:customStyle="1">
     <w:name w:val="InstatsCallout"/>
     <w:basedOn w:val="Normal"/>
+    <w:qFormat/>
     <w:pPr>
       <w:pBdr>
         <w:left w:val="single" w:sz="4" w:space="10" w:color="D5D5D7"/>
@@ -40869,6 +40280,7 @@
   </w:style>
   <w:style w:type="paragraph" w:styleId="Compact" w:customStyle="1">
     <w:name w:val="Compact"/>
+    <w:qFormat/>
     <w:pPr>
       <w:widowControl/>
       <w:suppressAutoHyphens w:val="true"/>
@@ -40887,6 +40299,7 @@
   </w:style>
   <w:style w:type="paragraph" w:styleId="FirstParagraph" w:customStyle="1">
     <w:name w:val="FirstParagraph"/>
+    <w:qFormat/>
     <w:pPr>
       <w:widowControl/>
       <w:suppressAutoHyphens w:val="true"/>
@@ -40905,6 +40318,7 @@
   </w:style>
   <w:style w:type="paragraph" w:styleId="BlockText" w:customStyle="1">
     <w:name w:val="BlockText"/>
+    <w:qFormat/>
     <w:pPr>
       <w:widowControl/>
       <w:suppressAutoHyphens w:val="true"/>
@@ -40925,6 +40339,7 @@
   <w:style w:type="paragraph" w:styleId="TableText" w:customStyle="1">
     <w:name w:val="TableText"/>
     <w:basedOn w:val="Normal"/>
+    <w:qFormat/>
     <w:pPr>
       <w:spacing w:lineRule="auto" w:line="278" w:before="40" w:after="40"/>
     </w:pPr>
@@ -40937,6 +40352,7 @@
   <w:style w:type="paragraph" w:styleId="TableHeader" w:customStyle="1">
     <w:name w:val="TableHeader"/>
     <w:basedOn w:val="TableText"/>
+    <w:qFormat/>
     <w:pPr>
       <w:spacing w:lineRule="auto" w:line="278" w:before="40" w:after="40"/>
     </w:pPr>
@@ -40950,6 +40366,7 @@
   <w:style w:type="paragraph" w:styleId="TableCaption" w:customStyle="1">
     <w:name w:val="TableCaption"/>
     <w:basedOn w:val="Normal"/>
+    <w:qFormat/>
     <w:pPr>
       <w:spacing w:lineRule="auto" w:line="300" w:before="40" w:after="280"/>
     </w:pPr>
@@ -40962,6 +40379,7 @@
   <w:style w:type="paragraph" w:styleId="AnswerRow" w:customStyle="1">
     <w:name w:val="AnswerRow"/>
     <w:basedOn w:val="Normal"/>
+    <w:qFormat/>
     <w:pPr>
       <w:keepNext w:val="true"/>
       <w:pBdr>
@@ -40996,6 +40414,7 @@
   </w:style>
   <w:style w:type="paragraph" w:styleId="FootnoteText1" w:customStyle="1">
     <w:name w:val="FootnoteText"/>
+    <w:qFormat/>
     <w:pPr>
       <w:widowControl/>
       <w:suppressAutoHyphens w:val="true"/>
@@ -41016,6 +40435,7 @@
     <w:name w:val="Source Code"/>
     <w:basedOn w:val="Normal"/>
     <w:link w:val="VerbatimChar"/>
+    <w:qFormat/>
     <w:pPr/>
     <w:rPr>
       <w:rFonts w:ascii="Courier New" w:hAnsi="Courier New" w:eastAsia="Courier New" w:cs="Courier New"/>

</xml_diff>

<commit_message>
Repair Word packages and link companion report
</commit_message>
<xml_diff>
--- a/docs/Instats - The Institutional AI Readiness Pack.docx
+++ b/docs/Instats - The Institutional AI Readiness Pack.docx
@@ -25719,7 +25719,7 @@
       <w:hyperlink r:id="rId32">
         <w:r>
           <w:rPr>
-            <w:rStyle w:val="Hyperlink"/>
+            <w:rStyle w:val="Hyperlink1"/>
             <w:i w:val="1"/>
           </w:rPr>
           <w:t xml:space="preserve">The Institutional AI Readiness Pack: Self-Assessment and Implementation Tools for Responsible AI in Academic Research</w:t>
@@ -25734,7 +25734,7 @@
       <w:hyperlink r:id="rId33">
         <w:r>
           <w:rPr>
-            <w:rStyle w:val="Hyperlink"/>
+            <w:rStyle w:val="Hyperlink1"/>
             <w:i w:val="0"/>
           </w:rPr>
           <w:t xml:space="preserve">https://doi.org/10.61700/bv2nulyhht</w:t>
@@ -25761,7 +25761,7 @@
       <w:hyperlink r:id="rId34">
         <w:r>
           <w:rPr>
-            <w:rStyle w:val="Hyperlink"/>
+            <w:rStyle w:val="Hyperlink1"/>
             <w:i w:val="1"/>
           </w:rPr>
           <w:t xml:space="preserve">Responsible AI in Academic Research: A Competency Framework for Research Training</w:t>
@@ -25776,7 +25776,7 @@
       <w:hyperlink r:id="rId35">
         <w:r>
           <w:rPr>
-            <w:rStyle w:val="Hyperlink"/>
+            <w:rStyle w:val="Hyperlink1"/>
             <w:i w:val="0"/>
           </w:rPr>
           <w:t xml:space="preserve">https://doi.org/10.61700/t31oy23grr</w:t>
@@ -25803,7 +25803,7 @@
       <w:hyperlink r:id="rId36">
         <w:r>
           <w:rPr>
-            <w:rStyle w:val="Hyperlink"/>
+            <w:rStyle w:val="Hyperlink1"/>
             <w:i w:val="0"/>
           </w:rPr>
           <w:t xml:space="preserve">Creative Commons Attribution 4.0 International (CC BY 4.0)</w:t>
@@ -25815,6 +25815,7 @@
         </w:rPr>
         <w:t xml:space="preserve">. You may adapt them for institutional use with attribution.</w:t>
       </w:r>
+      <w:bookmarkEnd w:id="77"/>
     </w:p>
     <w:sectPr>
       <w:headerReference w:type="even" r:id="rId24"/>

</xml_diff>

<commit_message>
Clarify the section 1.1 ladder heading
</commit_message>
<xml_diff>
--- a/docs/Instats - The Institutional AI Readiness Pack.docx
+++ b/docs/Instats - The Institutional AI Readiness Pack.docx
@@ -636,12 +636,12 @@
         </w:numPr>
         <w:rPr/>
       </w:pPr>
-      <w:hyperlink w:anchor="the-rung-nobody-has-reached">
+      <w:hyperlink w:anchor="the-ladder-rung-nobody-has-reached">
         <w:r>
           <w:rPr>
             <w:rStyle w:val="Hyperlink"/>
           </w:rPr>
-          <w:t>1.1 The rung nobody has reached</w:t>
+          <w:t>1.1 The ladder rung nobody has reached</w:t>
         </w:r>
       </w:hyperlink>
     </w:p>
@@ -1559,10 +1559,10 @@
         <w:pStyle w:val="Heading2"/>
         <w:rPr/>
       </w:pPr>
-      <w:bookmarkStart w:id="18" w:name="the-rung-nobody-has-reached"/>
-      <w:r>
-        <w:rPr/>
-        <w:t>1.1 The rung nobody has reached</w:t>
+      <w:bookmarkStart w:id="18" w:name="the-ladder-rung-nobody-has-reached"/>
+      <w:r>
+        <w:rPr/>
+        <w:t>1.1 The ladder rung nobody has reached</w:t>
       </w:r>
     </w:p>
     <w:p>
@@ -33531,7 +33531,7 @@
                 <w:szCs w:val="22"/>
                 <w:lang w:val="en-US" w:eastAsia="en-US" w:bidi="ar-SA"/>
               </w:rPr>
-              <w:t>1.1 The rung nobody has reached</w:t>
+              <w:t>1.1 The ladder rung nobody has reached</w:t>
             </w:r>
           </w:p>
         </w:tc>

</xml_diff>

<commit_message>
Refine report abstract links and formatting
</commit_message>
<xml_diff>
--- a/docs/Instats - The Institutional AI Readiness Pack.docx
+++ b/docs/Instats - The Institutional AI Readiness Pack.docx
@@ -90,12 +90,26 @@
       </w:pPr>
       <w:r>
         <w:rPr/>
-        <w:t xml:space="preserve">The Institutional AI Readiness Pack is a university-wide assessment and implementation toolkit for responsible AI in research, spanning practice, people, policy, systems, procurement, data, disclosure, and oversight. It accompanies </w:t>
+        <w:t xml:space="preserve">The Institutional AI Readiness Pack and its accompanying </w:t>
+      </w:r>
+      <w:hyperlink r:id="rId12">
+        <w:r>
+          <w:rPr>
+            <w:rStyle w:val="Hyperlink"/>
+          </w:rPr>
+          <w:t>instruments catalogue</w:t>
+        </w:r>
+      </w:hyperlink>
+      <w:r>
+        <w:rPr/>
+        <w:t xml:space="preserve"> is a university-wide assessment and implementation toolkit for responsible AI in research, spanning practice, people, policy, systems, procurement, data, disclosure, and oversight. It accompanies </w:t>
       </w:r>
       <w:hyperlink r:id="rId2">
         <w:r>
           <w:rPr>
             <w:rStyle w:val="Hyperlink"/>
+            <w:i w:val="0"/>
+            <w:iCs w:val="0"/>
           </w:rPr>
           <w:t>Responsible AI in Academic Research: A Competency Framework for Research Training</w:t>
         </w:r>

</xml_diff>